<commit_message>
Revision 2: encryption section, robotics additions, commentary section, projections, summary chart
Co-Authored-By: Claude Fable 5 <noreply@anthropic.com>
Claude-Session: https://claude.ai/code/session_01TH4FvWsCmjqWdiHEwVVPV9
</commit_message>
<xml_diff>
--- a/core-tech-review/Expanded_Core_Tech_Section_Reviewed_8_26.docx
+++ b/core-tech-review/Expanded_Core_Tech_Section_Reviewed_8_26.docx
@@ -29,7 +29,7 @@
           <w:sz w:val="20"/>
           <w:szCs w:val="20"/>
         </w:rPr>
-        <w:t xml:space="preserve">Reviewed and reconciled against the Core Technology Overview of August 22, 2026 · Review draft of August 26, 2026 · Not yet adopted into the provisional patent application</w:t>
+        <w:t xml:space="preserve">Reviewed and reconciled against the Core Technology Overview of August 22, 2026 · Review draft of August 26, 2026, revision 2 · Not yet adopted into the provisional patent application</w:t>
       </w:r>
     </w:p>
     <w:p>
@@ -100,7 +100,7 @@
           <w:sz w:val="22"/>
           <w:szCs w:val="22"/>
         </w:rPr>
-        <w:t xml:space="preserve">At the core of QueryBook is the Fact Unit, a cognitive atom: a discrete, atomic, provenance-tracked knowledge record identified by a Fact Unit Identifier deterministically derived from the record’s content, source, and ingestion timestamp, and immutable once created, a revision producing a new, linked version rather than modifying the existing record. Each Fact Unit stores atomic meaning, contextual metadata, exceptions, semantic lineage, multimodal attachments, temporal anchors, a safety classification, a language-independent semantic fingerprint, and weighted semantic edges carrying meaning between units in a bidirectional, weighted, context-sensitive manner. A Fact Unit behaves structurally like a cortical column but does not function like a biological neuron: its content is fixed and does not fire or change state; what behaves neuron-like is its participation in cognition, as Fact Units enter activation sets, compete for retrieval, propagate meaning through weighted edges, and suppress incompatible units under biased competition. In plain language, the Fact Unit stores meaning, while its participation in reasoning behaves like a neuron. Reasoning is activation propagation across the semantic graph, resolved as a single deterministic convergence process. This biological parallel is stated under a governed correspondence methodology: a neuromorphic correspondence is admitted only where the primary scientific publication is verified, the correspondence is identified in a mechanism that already exists, and a deterministic structural principle is extracted, the admitted correspondences being convergence dynamics, attentional competition, consolidation, intersensory redundancy, and spatial coding. A correspondence explains why a mechanism is well-founded; no mechanism is adopted because it resembles a biological one.</w:t>
+        <w:t xml:space="preserve">At the core of QueryBook is the Fact Unit, a cognitive atom: a discrete, atomic, provenance-tracked knowledge record identified by a Fact Unit Identifier deterministically derived from the record’s content, source, and ingestion timestamp, and immutable once created, a revision producing a new, linked version rather than modifying the existing record. Each Fact Unit stores atomic meaning, contextual metadata, exceptions, semantic lineage, multimodal attachments, temporal anchors, a safety classification, a language-independent semantic fingerprint, and weighted semantic edges carrying meaning between units in a bidirectional, weighted, context-sensitive manner. A Fact Unit behaves structurally like a cortical column but does not function like a biological neuron: its content is fixed and does not fire or change state; what behaves neuron-like is its participation in cognition, as Fact Units enter activation sets, compete for retrieval, propagate meaning through weighted edges, and suppress incompatible units under biased competition. In plain language, the Fact Unit stores meaning, while its participation in reasoning behaves like a neuron. Reasoning is activation propagation across the semantic graph, resolved as a single deterministic convergence process. The methodological standing of this and every other biological parallel in this document is collected in the Commentary on Neuromorphic Correspondences at the end of this document, so the body text reads without interruption.</w:t>
       </w:r>
     </w:p>
     <w:p>
@@ -453,7 +453,7 @@
           <w:sz w:val="22"/>
           <w:szCs w:val="22"/>
         </w:rPr>
-        <w:t xml:space="preserve">A perspective-modeling layer allows QueryBook to model other minds and intent, enabling empathy and social reasoning. Predictive modeling allows QueryBook to forecast outcomes, anticipate future states, and plan actions. Episodic simulation enables QueryBook to construct hypothetical scenarios, evaluate alternatives, and test consequences; this function parallels, as an analogy rather than a claimed structural correspondence, the role of the hippocampus in human cognition, where episodic memory supports imagination, planning, and counterfactual reasoning. Cross-temporal reasoning allows QueryBook to align past, present, and future states, paralleling in the same analogical sense the human prefrontal cortex, which integrates temporal information to support long-range planning and decision-making. The system distinguishes three temporal postures and states which produced each response: attested past, resolving under an attestation cutoff; live present, reading the live layer over the committed layer; and projected future, carrying a credible interval, with a projected result never admitted as a knowledge record and never grounding a subsequent answer. The self-modeling layer tracks QueryBook’s own knowledge, limitations, and internal state, enabling introspection, self-correction, and metacognitive regulation. The analogy engine maps structure across domains, enabling creativity, generalization, and cross-domain synthesis. Emotional context modeling allows QueryBook to interpret user intent, social cues, ergonomic comfort, and contextual appropriateness, improving alignment and communication, within the stated consent boundaries: a supportive expressive register is selected only on a stated preference, a configured default, or an existing consented signal, never by inference from word choice, punctuation, length, error rate, or timing, and a stated ergonomic preference always overrides an inferred signal. QueryBook’s motivational architecture functions as a structural counterpart of the human reward system, guiding prioritization, exploration, and cognitive-effort allocation toward clarity, safety, coherence, and user-aligned outcomes. Long-term concept consolidation operates as QueryBook’s equivalent of human sleep: during consolidation cycles, QueryBook compresses concepts, strengthens stable relationships, resolves contradictions, and integrates new knowledge into its worldview hypergraph, ensuring long-term stability, coherence, and conceptual clarity.</w:t>
+        <w:t xml:space="preserve">A perspective-modeling layer allows QueryBook to model other minds and intent, enabling empathy and social reasoning. Predictive modeling allows QueryBook to forecast outcomes, anticipate future states, and plan actions. Episodic simulation enables QueryBook to construct hypothetical scenarios, evaluate alternatives, and test consequences; this function parallels the role of the hippocampus in human cognition, where episodic memory supports imagination, planning, and counterfactual reasoning. Cross-temporal reasoning allows QueryBook to align past, present, and future states, mirroring the function of the human prefrontal cortex, which integrates temporal information to support long-range planning and decision-making. The system distinguishes three temporal postures and states which produced each response: attested past, resolving under an attestation cutoff; live present, reading the live layer over the committed layer; and projected future, carrying a credible interval, with a projected result never admitted as a knowledge record and never grounding a subsequent answer. The self-modeling layer tracks QueryBook’s own knowledge, limitations, and internal state, enabling introspection, self-correction, and metacognitive regulation. The analogy engine maps structure across domains, enabling creativity, generalization, and cross-domain synthesis. Emotional context modeling allows QueryBook to interpret user intent, social cues, ergonomic comfort, and contextual appropriateness, improving alignment and communication, within the stated consent boundaries: a supportive expressive register is selected only on a stated preference, a configured default, or an existing consented signal, never by inference from word choice, punctuation, length, error rate, or timing, and a stated ergonomic preference always overrides an inferred signal. QueryBook’s motivational architecture functions as a structural counterpart of the human reward system, guiding prioritization, exploration, and cognitive-effort allocation toward clarity, safety, coherence, and user-aligned outcomes. Long-term concept consolidation operates as QueryBook’s equivalent of human sleep: during consolidation cycles, QueryBook compresses concepts, strengthens stable relationships, resolves contradictions, and integrates new knowledge into its worldview hypergraph, ensuring long-term stability, coherence, and conceptual clarity.</w:t>
       </w:r>
     </w:p>
     <w:p>
@@ -608,7 +608,7 @@
           <w:sz w:val="22"/>
           <w:szCs w:val="22"/>
         </w:rPr>
-        <w:t xml:space="preserve">QueryBook’s digital-rights architecture protects the entitlements of readers, authors, and publishers at the structural level rather than by policy alone. Every query is evaluated against the requesting identity’s actual licensed content scope before execution, enforced at the query-execution layer itself rather than as a post-hoc filter, and an excluded record is not traversable at all rather than removed from a result, so a response can never leak content the requester is not entitled to reach and the absence of withheld content is not itself signalled. A shared session is bounded by the intersection of its participants’ entitlements, so no participant receives a citation another cannot open. An opt-in, passphrase-derived encryption mechanism protects an individual user’s own session and interaction history such that the platform itself cannot decrypt that history without the user’s own passphrase, a zero-knowledge property in the standard security sense, and where this mechanism is active, account erasure is implemented cryptographically, destroying the associated key record and rendering the encrypted history permanently unreadable. Encryption keys are scoped per tenant or deployment so that a key of one tenant decrypts no content of another, and key material is held within a hardware custody boundary where a deployment configures one. Access to platform capabilities is governed by a role-based portal architecture scoped to defined roles, with a separate mechanism for granting a time-scoped, context-specific capability for a bounded purpose without broadening general access. A requesting identity may export the Fact Units, annotations, and interaction history it holds rights to, serialized to an open, non-proprietary format with provenance metadata preserved, without the export restricting continued access. Where an operator elects it for a specific published title, an external blockchain-based ownership-verification service may be registered for resale verification, the system acting as requesting party to that pre-existing external service while operating no blockchain infrastructure itself. And where content is moderated, the affected identity may appeal to a human reviewer distinct from the original moderator, with the decision and its stated reasoning logged against the original action’s provenance record.</w:t>
+        <w:t xml:space="preserve">QueryBook’s digital-rights architecture protects the entitlements of readers, authors, and publishers at the structural level rather than by policy alone. Every query is evaluated against the requesting identity’s actual licensed content scope before execution, enforced at the query-execution layer itself rather than as a post-hoc filter, and an excluded record is not traversable at all rather than removed from a result, so a response can never leak content the requester is not entitled to reach and the absence of withheld content is not itself signalled. A shared session is bounded by the intersection of its participants’ entitlements, so no participant receives a citation another cannot open. Access to platform capabilities is governed by a role-based portal architecture scoped to defined roles, with a separate mechanism for granting a time-scoped, context-specific capability for a bounded purpose without broadening general access. A requesting identity may export the Fact Units, annotations, and interaction history it holds rights to, serialized to an open, non-proprietary format with provenance metadata preserved, without the export restricting continued access. Where an operator elects it for a specific published title, an external blockchain-based ownership-verification service may be registered for resale verification, the system acting as requesting party to that pre-existing external service while operating no blockchain infrastructure itself. And where content is moderated, the affected identity may appeal to a human reviewer distinct from the original moderator, with the decision and its stated reasoning logged against the original action’s provenance record.</w:t>
       </w:r>
     </w:p>
     <w:p>
@@ -624,33 +624,20 @@
           <w:sz w:val="25"/>
           <w:szCs w:val="25"/>
         </w:rPr>
-        <w:t xml:space="preserve">QueryBook Query Response</w:t>
-      </w:r>
-    </w:p>
-    <w:p>
-      <w:pPr>
-        <w:spacing w:after="180" w:line="300"/>
-      </w:pPr>
-      <w:r>
-        <w:rPr>
-          <w:color w:val="1A1714"/>
-          <w:sz w:val="22"/>
-          <w:szCs w:val="22"/>
-        </w:rPr>
-        <w:t xml:space="preserve">QueryBook’s Brain-Grade Knowledge Engine transforms any book, video, manual, or digital resource into a living, interactive intelligence that works for the reader. It does not just summarize. It does not just explain. It does not just answer questions. Instead, it performs tasks, teaches skills, runs simulations, builds workflows, creates VR demonstrations, and executes multi-step reasoning, all inside the content the user already owns. Task execution is carried by a bounded, non-Turing-complete program representation compiled from natural-language instructions, which is what makes execution deterministic and auditable rather than open-ended, and immersive output is carried by the three-dimensional presentation subsystem. It can instantly produce a chapter summary, a beginner-friendly explanation, a technical deep dive, a risk-analysis overview, a timeline of a subject’s evolution, a glossary of all terms, a comparison of alternatives such as Bitcoin versus Ethereum, a VR model of blockchain blocks, a three-dimensional animation of mining difficulty, or a simulation of transaction propagation, each regenerated from the same Fact Unit graph under the structural-groundedness constraint and delivered with citations to its underlying records. Where content is produced for delivery to a reader, a corresponding accessible equivalent, alternative text for visual content, scene descriptions for immersive presentations, captions for audio, and structurally simplified variants for cognitive accessibility, is generated from the same source Fact Units, with production treated as incomplete until the accessible equivalent exists alongside it. This is intelligence applied directly to the content the user owns; it turns passive content into active capability. It can tutor, it can coach, it can simulate, it can advise, it can summarize.</w:t>
-      </w:r>
-    </w:p>
-    <w:p>
-      <w:pPr>
-        <w:spacing w:after="180" w:line="300"/>
-      </w:pPr>
-      <w:r>
-        <w:rPr>
-          <w:color w:val="1A1714"/>
-          <w:sz w:val="22"/>
-          <w:szCs w:val="22"/>
-        </w:rPr>
-        <w:t xml:space="preserve">When a book, document, or media asset is uploaded into QueryBook, authors can add supplemental information, which is admitted as its own registered source class contributing to the diversity of evidence behind the work’s assertions. QueryBook also generates, at ingestion, the probable questions that will be asked about the book, together with their summaries and fully-cited answers; these are stored and served with near-zero latency, and each pre-computed answer is invalidated upon revision of any contributing record, so a served answer is never stale.</w:t>
+        <w:t xml:space="preserve">Encryption and Data Protection</w:t>
+      </w:r>
+    </w:p>
+    <w:p>
+      <w:pPr>
+        <w:spacing w:after="180" w:line="300"/>
+      </w:pPr>
+      <w:r>
+        <w:rPr>
+          <w:color w:val="1A1714"/>
+          <w:sz w:val="22"/>
+          <w:szCs w:val="22"/>
+        </w:rPr>
+        <w:t xml:space="preserve">Encryption in QueryBook is architectural, and it protects the user against every party, including the platform operator itself. An opt-in, passphrase-derived encryption mechanism protects an individual user’s own session and interaction history such that the platform itself cannot decrypt that history without the user’s own passphrase, a zero-knowledge property in the standard security sense; no operator-held key exists for that content under any configuration while the election is in effect. Where this mechanism is active, account erasure is implemented cryptographically: destroying the associated key record renders the encrypted history permanently unreadable without requiring individual enumeration and deletion of every underlying record, which makes erasure exact, immediate, and provable rather than a best-effort sweep. Encryption keys are scoped per tenant or per deployment, so that a key of one tenant decrypts no content of another and the blast radius of any compromise is structurally contained to a single tenant. Key material is held within a hardware or equivalent custody boundary where a deployment configures one, in which case the system holds a handle rather than the key and every use of the key is a call across that boundary, and the presence of a hardware module does not weaken the zero-knowledge election. Integrity protection runs alongside confidentiality: every node of the provenance ledger carries a keyed cryptographic checksum sufficient to detect any operation that bypassed a required safety evaluation, and each node is additionally signed under a key of the deployment, so the entire derivation chain is verifiable by a third party holding the corresponding verification key without access to the system that produced it. The combined advantage over conventional platform security is that privacy, erasure, tenancy isolation, and audit integrity are properties of the cryptography rather than promises of the operator, which is what makes QueryBook deployable in regulated, privacy-sensitive, and multi-tenant environments where a policy-based assurance would not suffice.</w:t>
       </w:r>
     </w:p>
     <w:p>
@@ -666,20 +653,33 @@
           <w:sz w:val="25"/>
           <w:szCs w:val="25"/>
         </w:rPr>
-        <w:t xml:space="preserve">QueryBook Applications</w:t>
-      </w:r>
-    </w:p>
-    <w:p>
-      <w:pPr>
-        <w:spacing w:after="180" w:line="300"/>
-      </w:pPr>
-      <w:r>
-        <w:rPr>
-          <w:color w:val="1A1714"/>
-          <w:sz w:val="22"/>
-          <w:szCs w:val="22"/>
-        </w:rPr>
-        <w:t xml:space="preserve">QueryBook supports a wide range of applications. First, single-book and multi-book question and answer: QueryBook can operate offline on a smartphone or online in a SaaS network, providing deterministic answers, multimodal explanations, and citation-linked outputs, and it far exceeds simple Q&amp;A systems because it uses a world model rather than keyword search or embeddings; during disconnected operation, query execution, provenance verification, and access-control enforcement all continue to function against a locally-held Fact Graph, with divergent states reconciled deterministically upon reconnection. Second, multi-document and multimodal analysis: QueryBook can analyze books, documents, videos, tables, datasets, and multimodal archives, and can perform economic forecasting, market analysis, policy modeling, scientific synthesis, and cross-domain reasoning, with contradiction and temporal-inconsistency detection operating across all ingested sources rather than being confined to any single one; forecasting operates under its stated discipline, in which the subject class is restricted to institutions, systems, and organisational processes, a projected-future result carries a credible interval and is never admitted as a knowledge record, and retrospective evaluation admits only records attested before the event in question, which is what makes the system’s forecast accuracy honestly measurable by horizon and confidence band. Third, QueryBook supports autonomous agents, robotic control, enterprise automation, global knowledge systems, multimodal education, and VR learning environments. Where an operator elects it, a contextual commerce layer may surface author-linked, publisher-linked, or third-party commercial content keyed to the concept a query resolves to, and its non-interference is structural rather than configurable: the grounded answer’s retrieval, ranking, and confidence computation are completed and finalized before the commerce layer is invoked, the layer receives only the resolved concept identifier as read-only input with no write path back into retrieval, ranking, or generation, commercial content is rendered in a distinct, source-labeled region and is never citable, never traversable, and contributes to no confidence value, and commerce is scheduled strictly below every safety-relevant category of compute.</w:t>
+        <w:t xml:space="preserve">QueryBook Query Response</w:t>
+      </w:r>
+    </w:p>
+    <w:p>
+      <w:pPr>
+        <w:spacing w:after="180" w:line="300"/>
+      </w:pPr>
+      <w:r>
+        <w:rPr>
+          <w:color w:val="1A1714"/>
+          <w:sz w:val="22"/>
+          <w:szCs w:val="22"/>
+        </w:rPr>
+        <w:t xml:space="preserve">QueryBook’s Brain-Grade Knowledge Engine transforms any book, video, manual, or digital resource into a living, interactive intelligence that works for the reader. It does not just summarize. It does not just explain. It does not just answer questions. Instead, it performs tasks, teaches skills, runs simulations, builds workflows, creates VR demonstrations, and executes multi-step reasoning, all inside the content the user already owns. Task execution is carried by a bounded, non-Turing-complete program representation compiled from natural-language instructions, which is what makes execution deterministic and auditable rather than open-ended, and immersive output is carried by the three-dimensional presentation subsystem. It can instantly produce a chapter summary, a beginner-friendly explanation, a technical deep dive, a risk-analysis overview, a timeline of a subject’s evolution, a glossary of all terms, a comparison of alternatives such as Bitcoin versus Ethereum, a VR model of blockchain blocks, a three-dimensional animation of mining difficulty, or a simulation of transaction propagation, each regenerated from the same Fact Unit graph under the structural-groundedness constraint and delivered with citations to its underlying records. Where content is produced for delivery to a reader, a corresponding accessible equivalent, alternative text for visual content, scene descriptions for immersive presentations, captions for audio, and structurally simplified variants for cognitive accessibility, is generated from the same source Fact Units, with production treated as incomplete until the accessible equivalent exists alongside it. This is intelligence applied directly to the content the user owns; it turns passive content into active capability. It can tutor, it can coach, it can simulate, it can advise, it can summarize.</w:t>
+      </w:r>
+    </w:p>
+    <w:p>
+      <w:pPr>
+        <w:spacing w:after="180" w:line="300"/>
+      </w:pPr>
+      <w:r>
+        <w:rPr>
+          <w:color w:val="1A1714"/>
+          <w:sz w:val="22"/>
+          <w:szCs w:val="22"/>
+        </w:rPr>
+        <w:t xml:space="preserve">When a book, document, or media asset is uploaded into QueryBook, authors can add supplemental information, which is admitted as its own registered source class contributing to the diversity of evidence behind the work’s assertions. QueryBook also generates, at ingestion, the probable questions that will be asked about the book, together with their summaries and fully-cited answers; these are stored and served with near-zero latency, and each pre-computed answer is invalidated upon revision of any contributing record, so a served answer is never stale.</w:t>
       </w:r>
     </w:p>
     <w:p>
@@ -695,6 +695,35 @@
           <w:sz w:val="25"/>
           <w:szCs w:val="25"/>
         </w:rPr>
+        <w:t xml:space="preserve">QueryBook Applications</w:t>
+      </w:r>
+    </w:p>
+    <w:p>
+      <w:pPr>
+        <w:spacing w:after="180" w:line="300"/>
+      </w:pPr>
+      <w:r>
+        <w:rPr>
+          <w:color w:val="1A1714"/>
+          <w:sz w:val="22"/>
+          <w:szCs w:val="22"/>
+        </w:rPr>
+        <w:t xml:space="preserve">QueryBook supports a wide range of applications. First, single-book and multi-book question and answer: QueryBook can operate offline on a smartphone or online in a SaaS network, providing deterministic answers, multimodal explanations, and citation-linked outputs, and it far exceeds simple Q&amp;A systems because it uses a world model rather than keyword search or embeddings; during disconnected operation, query execution, provenance verification, and access-control enforcement all continue to function against a locally-held Fact Graph, with divergent states reconciled deterministically upon reconnection. Second, multi-document and multimodal analysis: QueryBook can analyze books, documents, videos, tables, datasets, and multimodal archives, and can perform economic forecasting, market analysis, policy modeling, scientific synthesis, and cross-domain reasoning, with contradiction and temporal-inconsistency detection operating across all ingested sources rather than being confined to any single one; forecasting operates under its stated discipline, in which the subject class is restricted to institutions, systems, and organisational processes, a projected-future result carries a credible interval and is never admitted as a knowledge record, and retrospective evaluation admits only records attested before the event in question, which is what makes the system’s forecast accuracy honestly measurable by horizon and confidence band. Third, QueryBook supports autonomous agents, robotic control, enterprise automation, global knowledge systems, multimodal education, and VR learning environments. Where an operator elects it, a contextual commerce layer may surface author-linked, publisher-linked, or third-party commercial content keyed to the concept a query resolves to, and its non-interference is structural rather than configurable: the grounded answer’s retrieval, ranking, and confidence computation are completed and finalized before the commerce layer is invoked, the layer receives only the resolved concept identifier as read-only input with no write path back into retrieval, ranking, or generation, commercial content is rendered in a distinct, source-labeled region and is never citable, never traversable, and contributes to no confidence value, and commerce is scheduled strictly below every safety-relevant category of compute.</w:t>
+      </w:r>
+    </w:p>
+    <w:p>
+      <w:pPr>
+        <w:pStyle w:val="Heading2"/>
+        <w:spacing w:after="140" w:before="280"/>
+      </w:pPr>
+      <w:r>
+        <w:rPr>
+          <w:b/>
+          <w:bCs/>
+          <w:color w:val="1A1714"/>
+          <w:sz w:val="25"/>
+          <w:szCs w:val="25"/>
+        </w:rPr>
         <w:t xml:space="preserve">Architectural Extensions</w:t>
       </w:r>
     </w:p>
@@ -708,20 +737,2661 @@
           <w:sz w:val="22"/>
           <w:szCs w:val="22"/>
         </w:rPr>
-        <w:t xml:space="preserve">QueryBook enables deterministic language translation by regenerating meaning directly from Fact Units. A dedicated multilingual regeneration capability generates natural-language output directly from the language-independent representation for a requested target language, applying the identical structural-groundedness constraint regardless of output language, rather than translating already-generated text after the fact. Three refinements qualify that regeneration: a wording-operative span, such as a quotation, a statutory phrase, a claim term, or a prescribed instruction, is reproduced verbatim in its source language with a separately-marked non-operative gloss, because regenerating a span that carries force alters the force; an idiom is resolved by substituting only a registered equivalent, a surface-similarity selection being refused; and two or more language realizations may be presented simultaneously, aligned by knowledge record rather than by position, so a citation taken in either resolves to the same record.</w:t>
-      </w:r>
-    </w:p>
-    <w:p>
-      <w:pPr>
-        <w:spacing w:after="180" w:line="300"/>
-      </w:pPr>
-      <w:r>
-        <w:rPr>
-          <w:color w:val="1A1714"/>
-          <w:sz w:val="22"/>
-          <w:szCs w:val="22"/>
-        </w:rPr>
-        <w:t xml:space="preserve">QueryBook enables audio and video compression by storing meaning rather than pixels, allowing extreme compression and semantic reconstruction, and it can reconstruct three-dimensional VR environments, colorize historical media, and generate volumetric scenes with spatial consistency. Reconstruction operates under the platform’s stated constraints, which are what make it trustworthy: a reconstructed region is marked and never presented as observed, its confidence is bounded by the lesser of the observed and stored confidences, it is inadmissible as grounding for any assertion, and where convergence fails no reconstruction is produced and the gap is reported, because a frame with a hole is truthful while a hole filled with a guess presented as observation is not. Robotics benefits from semantic alignment, stabilized sensor data, registered physical constraints, and multimodal ingestion. Robotic and device integration observes the platform’s boundaries: external platforms receive only specific, declared actions through the connector architecture and confer no broader authority; direct command emission is permitted only to registered equipment of the capture-and-inspection class, with every command evaluated before emission against operating volume, kinematic envelope, velocity and force limits, clearance, and human proximity, a violating command being withheld unconditionally; assistive physical contact operates under a disjoint authorization class requiring a deployment authorization and the person’s own revocable consent concurrently; and the prohibition on any control interface to a vehicle system stands. An external machine-learning engine may additionally be prompted and its reply ingested as knowledge records, each permanently marked with its engine derivation, disclosed at the point of citation, bounded in confidence by the engine’s registered reliability, and counted as a single source class so that repetition manufactures no confidence, which allows QueryBook to harvest external generative capability without inheriting its groundlessness.</w:t>
+        <w:t xml:space="preserve">QueryBook enables deterministic language translation by regenerating meaning directly from Fact Units. A dedicated multilingual regeneration capability generates natural-language output directly from the language-independent representation for a requested target language, applying the identical structural-groundedness constraint regardless of output language, rather than translating already-generated text after the fact. Three refinements qualify that regeneration: a wording-operative span, such as a quotation, a statutory phrase, a claim term, or a prescribed instruction, is reproduced verbatim in its source language with a separately-marked non-operative gloss, because regenerating a span that carries force alters the force; an idiom is resolved by substituting only a registered equivalent, a surface-similarity selection being refused; and two or more language realizations may be presented simultaneously, aligned by knowledge record rather than by position, so a citation taken in either resolves to the same record. The projected benefits over conventional translation methods follow directly from the architecture. Because meaning is stored once, language-independently, adding a language is projected to cost a regeneration profile rather than a re-ingestion of the corpus, where systems that store knowledge at the language level must re-process, re-embed, or re-train per language. Because output is regenerated from records rather than translated from already-generated text, the compounding error of translate-after-generate pipelines, in which a generation error and a translation error multiply, is structurally absent. Because generation in every language operates under the identical structural-groundedness constraint, the class of translation failure in which fluent output diverges from source meaning is projected to be eliminated within the grounded pipeline rather than statistically reduced. And because citations align by knowledge record across languages, a multilingual deployment maintains one auditable body of knowledge rather than a set of parallel, silently diverging translations, which no post-hoc translation method can offer.</w:t>
+      </w:r>
+    </w:p>
+    <w:p>
+      <w:pPr>
+        <w:spacing w:after="180" w:line="300"/>
+      </w:pPr>
+      <w:r>
+        <w:rPr>
+          <w:color w:val="1A1714"/>
+          <w:sz w:val="22"/>
+          <w:szCs w:val="22"/>
+        </w:rPr>
+        <w:t xml:space="preserve">QueryBook enables audio and video compression by storing meaning rather than pixels, allowing extreme compression and semantic reconstruction, and it can reconstruct three-dimensional VR environments, colorize historical media, and generate volumetric scenes with spatial consistency. Reconstruction operates under the platform’s stated constraints, which are what make it trustworthy: a reconstructed region is marked and never presented as observed, its confidence is bounded by the lesser of the observed and stored confidences, it is inadmissible as grounding for any assertion, and where convergence fails no reconstruction is produced and the gap is reported, because a frame with a hole is truthful while a hole filled with a guess presented as observation is not. The projected advantage of semantic compression over current methods is substantial. Conventional codec compression reduces raw media by discarding perceptual redundancy while remaining bound to the pixel and waveform level, so its output still grows with resolution, frame rate, and duration. Storing meaning and regenerating the surface is projected to reduce storage and transmission requirements by a further ninety to ninety-nine percent relative to conventional codec output for content whose value lies in its meaning, an estimated ten-fold to one-hundred-fold additional reduction, because the stored representation grows with the information in the scene rather than with the pixels used to display it. Expansion carries the complementary projected advantage: because regeneration proceeds from meaning rather than from a fixed raster, the same stored records can be expanded to any target resolution, modality, or presentation form, including volumetric and VR presentation, without re-encoding and without a generational quality loss, where conventional methods remain bound to the fidelity captured at encoding time. These figures are stated as projections pending measured validation and are not asserted as verified performance claims. Robotics benefits from semantic alignment, stabilized sensor data, registered physical constraints, and multimodal ingestion. Robotic capability draws directly on the cognitive substrate described throughout this document: the World-View Model supplies the causal, spatial, and physical understanding a robotic task requires, including the registered physical constraints against which every candidate action is evaluated, and the Skill Inventory Layer supplies the procedural memory, storing how to perform tasks, manipulate objects, and execute multi-step operations as retrievable, provenance-tracked knowledge. QueryBook acquires and refines these robotic skills the way it acquires concepts: through sensory input from direct experience, with visual, spatial, tactile, and temporal observation building concept models before any language label attaches, and through ingested video, which enters the same Fact Unit graph through the ordinary video modality, so that a task demonstrated once on video becomes a procedural concept available to every deployment entitled to it. Robotic and device integration observes the platform’s boundaries: external platforms receive only specific, declared actions through the connector architecture and confer no broader authority; direct command emission is permitted only to registered equipment of the capture-and-inspection class, with every command evaluated before emission against operating volume, kinematic envelope, velocity and force limits, clearance, and human proximity, a violating command being withheld unconditionally; assistive physical contact operates under a disjoint authorization class requiring a deployment authorization and the person’s own revocable consent concurrently; and the prohibition on any control interface to a vehicle system stands. An external machine-learning engine may additionally be prompted and its reply ingested as knowledge records, each permanently marked with its engine derivation, disclosed at the point of citation, bounded in confidence by the engine’s registered reliability, and counted as a single source class so that repetition manufactures no confidence, which allows QueryBook to harvest external generative capability without inheriting its groundlessness.</w:t>
+      </w:r>
+    </w:p>
+    <w:p>
+      <w:pPr>
+        <w:pStyle w:val="Heading1"/>
+        <w:spacing w:after="180" w:before="360"/>
+      </w:pPr>
+      <w:r>
+        <w:rPr>
+          <w:b/>
+          <w:bCs/>
+          <w:color w:val="1A1714"/>
+          <w:sz w:val="30"/>
+          <w:szCs w:val="30"/>
+        </w:rPr>
+        <w:t xml:space="preserve">Summary Chart: QueryBook’s Progressive Cognitive Architecture</w:t>
+      </w:r>
+    </w:p>
+    <w:p>
+      <w:pPr>
+        <w:spacing w:after="180" w:line="300"/>
+      </w:pPr>
+      <w:r>
+        <w:rPr>
+          <w:color w:val="1A1714"/>
+          <w:sz w:val="22"/>
+          <w:szCs w:val="22"/>
+        </w:rPr>
+        <w:t xml:space="preserve">QueryBook’s cognitive abilities build in four progressive levels, each constructed on top of the level beneath it. Level One is the deterministic substrate; Level Two builds conceptual understanding upon it; Level Three integrates reasoning, prediction, and cross-domain synthesis; and Level Four adds governed self-evolution. The chart below lists, under each level, the layers, engines, and processes contributing to that level, the function each performs, and the advancement each provides.</w:t>
+      </w:r>
+    </w:p>
+    <w:p>
+      <w:pPr>
+        <w:pStyle w:val="Heading2"/>
+        <w:spacing w:after="140" w:before="280"/>
+      </w:pPr>
+      <w:r>
+        <w:rPr>
+          <w:b/>
+          <w:bCs/>
+          <w:color w:val="1A1714"/>
+          <w:sz w:val="25"/>
+          <w:szCs w:val="25"/>
+        </w:rPr>
+        <w:t xml:space="preserve">Level One — Core Technology: Fact Unit Deterministic Reasoning</w:t>
+      </w:r>
+    </w:p>
+    <w:tbl>
+      <w:tblPr>
+        <w:tblW w:type="dxa" w:w="9360"/>
+        <w:tblBorders>
+          <w:top w:val="single" w:color="auto" w:sz="4"/>
+          <w:left w:val="single" w:color="auto" w:sz="4"/>
+          <w:bottom w:val="single" w:color="auto" w:sz="4"/>
+          <w:right w:val="single" w:color="auto" w:sz="4"/>
+          <w:insideH w:val="single" w:color="auto" w:sz="4"/>
+          <w:insideV w:val="single" w:color="auto" w:sz="4"/>
+        </w:tblBorders>
+      </w:tblPr>
+      <w:tblGrid>
+        <w:gridCol w:w="2600"/>
+        <w:gridCol w:w="3380"/>
+        <w:gridCol w:w="3380"/>
+      </w:tblGrid>
+      <w:tr>
+        <w:trPr>
+          <w:tblHeader/>
+        </w:trPr>
+        <w:tc>
+          <w:tcPr>
+            <w:tcW w:type="dxa" w:w="2600"/>
+            <w:shd w:fill="F0ECE5" w:color="auto" w:val="clear"/>
+            <w:tcMar>
+              <w:top w:type="dxa" w:w="90"/>
+              <w:left w:type="dxa" w:w="120"/>
+              <w:bottom w:type="dxa" w:w="90"/>
+              <w:right w:type="dxa" w:w="120"/>
+            </w:tcMar>
+          </w:tcPr>
+          <w:p>
+            <w:pPr>
+              <w:spacing w:after="0" w:line="260"/>
+            </w:pPr>
+            <w:r>
+              <w:rPr>
+                <w:rFonts w:ascii="Arial" w:cs="Arial" w:eastAsia="Arial" w:hAnsi="Arial"/>
+                <w:b/>
+                <w:bCs/>
+                <w:color w:val="1A1714"/>
+                <w:sz w:val="19"/>
+                <w:szCs w:val="19"/>
+              </w:rPr>
+              <w:t xml:space="preserve">Subsystem</w:t>
+            </w:r>
+          </w:p>
+        </w:tc>
+        <w:tc>
+          <w:tcPr>
+            <w:tcW w:type="dxa" w:w="3380"/>
+            <w:shd w:fill="F0ECE5" w:color="auto" w:val="clear"/>
+            <w:tcMar>
+              <w:top w:type="dxa" w:w="90"/>
+              <w:left w:type="dxa" w:w="120"/>
+              <w:bottom w:type="dxa" w:w="90"/>
+              <w:right w:type="dxa" w:w="120"/>
+            </w:tcMar>
+          </w:tcPr>
+          <w:p>
+            <w:pPr>
+              <w:spacing w:after="0" w:line="260"/>
+            </w:pPr>
+            <w:r>
+              <w:rPr>
+                <w:rFonts w:ascii="Arial" w:cs="Arial" w:eastAsia="Arial" w:hAnsi="Arial"/>
+                <w:b/>
+                <w:bCs/>
+                <w:color w:val="1A1714"/>
+                <w:sz w:val="19"/>
+                <w:szCs w:val="19"/>
+              </w:rPr>
+              <w:t xml:space="preserve">Function</w:t>
+            </w:r>
+          </w:p>
+        </w:tc>
+        <w:tc>
+          <w:tcPr>
+            <w:tcW w:type="dxa" w:w="3380"/>
+            <w:shd w:fill="F0ECE5" w:color="auto" w:val="clear"/>
+            <w:tcMar>
+              <w:top w:type="dxa" w:w="90"/>
+              <w:left w:type="dxa" w:w="120"/>
+              <w:bottom w:type="dxa" w:w="90"/>
+              <w:right w:type="dxa" w:w="120"/>
+            </w:tcMar>
+          </w:tcPr>
+          <w:p>
+            <w:pPr>
+              <w:spacing w:after="0" w:line="260"/>
+            </w:pPr>
+            <w:r>
+              <w:rPr>
+                <w:rFonts w:ascii="Arial" w:cs="Arial" w:eastAsia="Arial" w:hAnsi="Arial"/>
+                <w:b/>
+                <w:bCs/>
+                <w:color w:val="1A1714"/>
+                <w:sz w:val="19"/>
+                <w:szCs w:val="19"/>
+              </w:rPr>
+              <w:t xml:space="preserve">Advancement</w:t>
+            </w:r>
+          </w:p>
+        </w:tc>
+      </w:tr>
+      <w:tr>
+        <w:tc>
+          <w:tcPr>
+            <w:tcW w:type="dxa" w:w="2600"/>
+            <w:tcMar>
+              <w:top w:type="dxa" w:w="90"/>
+              <w:left w:type="dxa" w:w="120"/>
+              <w:bottom w:type="dxa" w:w="90"/>
+              <w:right w:type="dxa" w:w="120"/>
+            </w:tcMar>
+          </w:tcPr>
+          <w:p>
+            <w:pPr>
+              <w:spacing w:after="0" w:line="260"/>
+            </w:pPr>
+            <w:r>
+              <w:rPr>
+                <w:rFonts w:ascii="Georgia" w:cs="Georgia" w:eastAsia="Georgia" w:hAnsi="Georgia"/>
+                <w:b w:val="false"/>
+                <w:bCs w:val="false"/>
+                <w:color w:val="1A1714"/>
+                <w:sz w:val="20"/>
+                <w:szCs w:val="20"/>
+              </w:rPr>
+              <w:t xml:space="preserve">Fact Unit Architecture</w:t>
+            </w:r>
+          </w:p>
+        </w:tc>
+        <w:tc>
+          <w:tcPr>
+            <w:tcW w:type="dxa" w:w="3380"/>
+            <w:tcMar>
+              <w:top w:type="dxa" w:w="90"/>
+              <w:left w:type="dxa" w:w="120"/>
+              <w:bottom w:type="dxa" w:w="90"/>
+              <w:right w:type="dxa" w:w="120"/>
+            </w:tcMar>
+          </w:tcPr>
+          <w:p>
+            <w:pPr>
+              <w:spacing w:after="0" w:line="260"/>
+            </w:pPr>
+            <w:r>
+              <w:rPr>
+                <w:rFonts w:ascii="Georgia" w:cs="Georgia" w:eastAsia="Georgia" w:hAnsi="Georgia"/>
+                <w:b w:val="false"/>
+                <w:bCs w:val="false"/>
+                <w:color w:val="1A1714"/>
+                <w:sz w:val="20"/>
+                <w:szCs w:val="20"/>
+              </w:rPr>
+              <w:t xml:space="preserve">Stores atomic, provenance-tracked, language-independent meaning</w:t>
+            </w:r>
+          </w:p>
+        </w:tc>
+        <w:tc>
+          <w:tcPr>
+            <w:tcW w:type="dxa" w:w="3380"/>
+            <w:tcMar>
+              <w:top w:type="dxa" w:w="90"/>
+              <w:left w:type="dxa" w:w="120"/>
+              <w:bottom w:type="dxa" w:w="90"/>
+              <w:right w:type="dxa" w:w="120"/>
+            </w:tcMar>
+          </w:tcPr>
+          <w:p>
+            <w:pPr>
+              <w:spacing w:after="0" w:line="260"/>
+            </w:pPr>
+            <w:r>
+              <w:rPr>
+                <w:rFonts w:ascii="Georgia" w:cs="Georgia" w:eastAsia="Georgia" w:hAnsi="Georgia"/>
+                <w:b w:val="false"/>
+                <w:bCs w:val="false"/>
+                <w:color w:val="1A1714"/>
+                <w:sz w:val="20"/>
+                <w:szCs w:val="20"/>
+              </w:rPr>
+              <w:t xml:space="preserve">Enables verifiable grounding</w:t>
+            </w:r>
+          </w:p>
+        </w:tc>
+      </w:tr>
+      <w:tr>
+        <w:tc>
+          <w:tcPr>
+            <w:tcW w:type="dxa" w:w="2600"/>
+            <w:tcMar>
+              <w:top w:type="dxa" w:w="90"/>
+              <w:left w:type="dxa" w:w="120"/>
+              <w:bottom w:type="dxa" w:w="90"/>
+              <w:right w:type="dxa" w:w="120"/>
+            </w:tcMar>
+          </w:tcPr>
+          <w:p>
+            <w:pPr>
+              <w:spacing w:after="0" w:line="260"/>
+            </w:pPr>
+            <w:r>
+              <w:rPr>
+                <w:rFonts w:ascii="Georgia" w:cs="Georgia" w:eastAsia="Georgia" w:hAnsi="Georgia"/>
+                <w:b w:val="false"/>
+                <w:bCs w:val="false"/>
+                <w:color w:val="1A1714"/>
+                <w:sz w:val="20"/>
+                <w:szCs w:val="20"/>
+              </w:rPr>
+              <w:t xml:space="preserve">Neuromorphic Cognitive Layer</w:t>
+            </w:r>
+          </w:p>
+        </w:tc>
+        <w:tc>
+          <w:tcPr>
+            <w:tcW w:type="dxa" w:w="3380"/>
+            <w:tcMar>
+              <w:top w:type="dxa" w:w="90"/>
+              <w:left w:type="dxa" w:w="120"/>
+              <w:bottom w:type="dxa" w:w="90"/>
+              <w:right w:type="dxa" w:w="120"/>
+            </w:tcMar>
+          </w:tcPr>
+          <w:p>
+            <w:pPr>
+              <w:spacing w:after="0" w:line="260"/>
+            </w:pPr>
+            <w:r>
+              <w:rPr>
+                <w:rFonts w:ascii="Georgia" w:cs="Georgia" w:eastAsia="Georgia" w:hAnsi="Georgia"/>
+                <w:b w:val="false"/>
+                <w:bCs w:val="false"/>
+                <w:color w:val="1A1714"/>
+                <w:sz w:val="20"/>
+                <w:szCs w:val="20"/>
+              </w:rPr>
+              <w:t xml:space="preserve">Stabilizes retrieval through deterministic convergence</w:t>
+            </w:r>
+          </w:p>
+        </w:tc>
+        <w:tc>
+          <w:tcPr>
+            <w:tcW w:type="dxa" w:w="3380"/>
+            <w:tcMar>
+              <w:top w:type="dxa" w:w="90"/>
+              <w:left w:type="dxa" w:w="120"/>
+              <w:bottom w:type="dxa" w:w="90"/>
+              <w:right w:type="dxa" w:w="120"/>
+            </w:tcMar>
+          </w:tcPr>
+          <w:p>
+            <w:pPr>
+              <w:spacing w:after="0" w:line="260"/>
+            </w:pPr>
+            <w:r>
+              <w:rPr>
+                <w:rFonts w:ascii="Georgia" w:cs="Georgia" w:eastAsia="Georgia" w:hAnsi="Georgia"/>
+                <w:b w:val="false"/>
+                <w:bCs w:val="false"/>
+                <w:color w:val="1A1714"/>
+                <w:sz w:val="20"/>
+                <w:szCs w:val="20"/>
+              </w:rPr>
+              <w:t xml:space="preserve">Enables one best-supported interpretation</w:t>
+            </w:r>
+          </w:p>
+        </w:tc>
+      </w:tr>
+      <w:tr>
+        <w:tc>
+          <w:tcPr>
+            <w:tcW w:type="dxa" w:w="2600"/>
+            <w:tcMar>
+              <w:top w:type="dxa" w:w="90"/>
+              <w:left w:type="dxa" w:w="120"/>
+              <w:bottom w:type="dxa" w:w="90"/>
+              <w:right w:type="dxa" w:w="120"/>
+            </w:tcMar>
+          </w:tcPr>
+          <w:p>
+            <w:pPr>
+              <w:spacing w:after="0" w:line="260"/>
+            </w:pPr>
+            <w:r>
+              <w:rPr>
+                <w:rFonts w:ascii="Georgia" w:cs="Georgia" w:eastAsia="Georgia" w:hAnsi="Georgia"/>
+                <w:b w:val="false"/>
+                <w:bCs w:val="false"/>
+                <w:color w:val="1A1714"/>
+                <w:sz w:val="20"/>
+                <w:szCs w:val="20"/>
+              </w:rPr>
+              <w:t xml:space="preserve">Provenance Ledger</w:t>
+            </w:r>
+          </w:p>
+        </w:tc>
+        <w:tc>
+          <w:tcPr>
+            <w:tcW w:type="dxa" w:w="3380"/>
+            <w:tcMar>
+              <w:top w:type="dxa" w:w="90"/>
+              <w:left w:type="dxa" w:w="120"/>
+              <w:bottom w:type="dxa" w:w="90"/>
+              <w:right w:type="dxa" w:w="120"/>
+            </w:tcMar>
+          </w:tcPr>
+          <w:p>
+            <w:pPr>
+              <w:spacing w:after="0" w:line="260"/>
+            </w:pPr>
+            <w:r>
+              <w:rPr>
+                <w:rFonts w:ascii="Georgia" w:cs="Georgia" w:eastAsia="Georgia" w:hAnsi="Georgia"/>
+                <w:b w:val="false"/>
+                <w:bCs w:val="false"/>
+                <w:color w:val="1A1714"/>
+                <w:sz w:val="20"/>
+                <w:szCs w:val="20"/>
+              </w:rPr>
+              <w:t xml:space="preserve">Records every derivation in a signed, tamper-evident chain</w:t>
+            </w:r>
+          </w:p>
+        </w:tc>
+        <w:tc>
+          <w:tcPr>
+            <w:tcW w:type="dxa" w:w="3380"/>
+            <w:tcMar>
+              <w:top w:type="dxa" w:w="90"/>
+              <w:left w:type="dxa" w:w="120"/>
+              <w:bottom w:type="dxa" w:w="90"/>
+              <w:right w:type="dxa" w:w="120"/>
+            </w:tcMar>
+          </w:tcPr>
+          <w:p>
+            <w:pPr>
+              <w:spacing w:after="0" w:line="260"/>
+            </w:pPr>
+            <w:r>
+              <w:rPr>
+                <w:rFonts w:ascii="Georgia" w:cs="Georgia" w:eastAsia="Georgia" w:hAnsi="Georgia"/>
+                <w:b w:val="false"/>
+                <w:bCs w:val="false"/>
+                <w:color w:val="1A1714"/>
+                <w:sz w:val="20"/>
+                <w:szCs w:val="20"/>
+              </w:rPr>
+              <w:t xml:space="preserve">Enables third-party verification</w:t>
+            </w:r>
+          </w:p>
+        </w:tc>
+      </w:tr>
+      <w:tr>
+        <w:tc>
+          <w:tcPr>
+            <w:tcW w:type="dxa" w:w="2600"/>
+            <w:tcMar>
+              <w:top w:type="dxa" w:w="90"/>
+              <w:left w:type="dxa" w:w="120"/>
+              <w:bottom w:type="dxa" w:w="90"/>
+              <w:right w:type="dxa" w:w="120"/>
+            </w:tcMar>
+          </w:tcPr>
+          <w:p>
+            <w:pPr>
+              <w:spacing w:after="0" w:line="260"/>
+            </w:pPr>
+            <w:r>
+              <w:rPr>
+                <w:rFonts w:ascii="Georgia" w:cs="Georgia" w:eastAsia="Georgia" w:hAnsi="Georgia"/>
+                <w:b w:val="false"/>
+                <w:bCs w:val="false"/>
+                <w:color w:val="1A1714"/>
+                <w:sz w:val="20"/>
+                <w:szCs w:val="20"/>
+              </w:rPr>
+              <w:t xml:space="preserve">Evidence-Pair Confidence Model</w:t>
+            </w:r>
+          </w:p>
+        </w:tc>
+        <w:tc>
+          <w:tcPr>
+            <w:tcW w:type="dxa" w:w="3380"/>
+            <w:tcMar>
+              <w:top w:type="dxa" w:w="90"/>
+              <w:left w:type="dxa" w:w="120"/>
+              <w:bottom w:type="dxa" w:w="90"/>
+              <w:right w:type="dxa" w:w="120"/>
+            </w:tcMar>
+          </w:tcPr>
+          <w:p>
+            <w:pPr>
+              <w:spacing w:after="0" w:line="260"/>
+            </w:pPr>
+            <w:r>
+              <w:rPr>
+                <w:rFonts w:ascii="Georgia" w:cs="Georgia" w:eastAsia="Georgia" w:hAnsi="Georgia"/>
+                <w:b w:val="false"/>
+                <w:bCs w:val="false"/>
+                <w:color w:val="1A1714"/>
+                <w:sz w:val="20"/>
+                <w:szCs w:val="20"/>
+              </w:rPr>
+              <w:t xml:space="preserve">Accumulates evidence for and against, weighted by source diversity</w:t>
+            </w:r>
+          </w:p>
+        </w:tc>
+        <w:tc>
+          <w:tcPr>
+            <w:tcW w:type="dxa" w:w="3380"/>
+            <w:tcMar>
+              <w:top w:type="dxa" w:w="90"/>
+              <w:left w:type="dxa" w:w="120"/>
+              <w:bottom w:type="dxa" w:w="90"/>
+              <w:right w:type="dxa" w:w="120"/>
+            </w:tcMar>
+          </w:tcPr>
+          <w:p>
+            <w:pPr>
+              <w:spacing w:after="0" w:line="260"/>
+            </w:pPr>
+            <w:r>
+              <w:rPr>
+                <w:rFonts w:ascii="Georgia" w:cs="Georgia" w:eastAsia="Georgia" w:hAnsi="Georgia"/>
+                <w:b w:val="false"/>
+                <w:bCs w:val="false"/>
+                <w:color w:val="1A1714"/>
+                <w:sz w:val="20"/>
+                <w:szCs w:val="20"/>
+              </w:rPr>
+              <w:t xml:space="preserve">Enables calibrated, revisable belief</w:t>
+            </w:r>
+          </w:p>
+        </w:tc>
+      </w:tr>
+      <w:tr>
+        <w:tc>
+          <w:tcPr>
+            <w:tcW w:type="dxa" w:w="2600"/>
+            <w:tcMar>
+              <w:top w:type="dxa" w:w="90"/>
+              <w:left w:type="dxa" w:w="120"/>
+              <w:bottom w:type="dxa" w:w="90"/>
+              <w:right w:type="dxa" w:w="120"/>
+            </w:tcMar>
+          </w:tcPr>
+          <w:p>
+            <w:pPr>
+              <w:spacing w:after="0" w:line="260"/>
+            </w:pPr>
+            <w:r>
+              <w:rPr>
+                <w:rFonts w:ascii="Georgia" w:cs="Georgia" w:eastAsia="Georgia" w:hAnsi="Georgia"/>
+                <w:b w:val="false"/>
+                <w:bCs w:val="false"/>
+                <w:color w:val="1A1714"/>
+                <w:sz w:val="20"/>
+                <w:szCs w:val="20"/>
+              </w:rPr>
+              <w:t xml:space="preserve">Ontology Mesh</w:t>
+            </w:r>
+          </w:p>
+        </w:tc>
+        <w:tc>
+          <w:tcPr>
+            <w:tcW w:type="dxa" w:w="3380"/>
+            <w:tcMar>
+              <w:top w:type="dxa" w:w="90"/>
+              <w:left w:type="dxa" w:w="120"/>
+              <w:bottom w:type="dxa" w:w="90"/>
+              <w:right w:type="dxa" w:w="120"/>
+            </w:tcMar>
+          </w:tcPr>
+          <w:p>
+            <w:pPr>
+              <w:spacing w:after="0" w:line="260"/>
+            </w:pPr>
+            <w:r>
+              <w:rPr>
+                <w:rFonts w:ascii="Georgia" w:cs="Georgia" w:eastAsia="Georgia" w:hAnsi="Georgia"/>
+                <w:b w:val="false"/>
+                <w:bCs w:val="false"/>
+                <w:color w:val="1A1714"/>
+                <w:sz w:val="20"/>
+                <w:szCs w:val="20"/>
+              </w:rPr>
+              <w:t xml:space="preserve">Governs concept and predicate identity across the graph</w:t>
+            </w:r>
+          </w:p>
+        </w:tc>
+        <w:tc>
+          <w:tcPr>
+            <w:tcW w:type="dxa" w:w="3380"/>
+            <w:tcMar>
+              <w:top w:type="dxa" w:w="90"/>
+              <w:left w:type="dxa" w:w="120"/>
+              <w:bottom w:type="dxa" w:w="90"/>
+              <w:right w:type="dxa" w:w="120"/>
+            </w:tcMar>
+          </w:tcPr>
+          <w:p>
+            <w:pPr>
+              <w:spacing w:after="0" w:line="260"/>
+            </w:pPr>
+            <w:r>
+              <w:rPr>
+                <w:rFonts w:ascii="Georgia" w:cs="Georgia" w:eastAsia="Georgia" w:hAnsi="Georgia"/>
+                <w:b w:val="false"/>
+                <w:bCs w:val="false"/>
+                <w:color w:val="1A1714"/>
+                <w:sz w:val="20"/>
+                <w:szCs w:val="20"/>
+              </w:rPr>
+              <w:t xml:space="preserve">Enables consistent cross-domain vocabulary</w:t>
+            </w:r>
+          </w:p>
+        </w:tc>
+      </w:tr>
+      <w:tr>
+        <w:tc>
+          <w:tcPr>
+            <w:tcW w:type="dxa" w:w="2600"/>
+            <w:tcMar>
+              <w:top w:type="dxa" w:w="90"/>
+              <w:left w:type="dxa" w:w="120"/>
+              <w:bottom w:type="dxa" w:w="90"/>
+              <w:right w:type="dxa" w:w="120"/>
+            </w:tcMar>
+          </w:tcPr>
+          <w:p>
+            <w:pPr>
+              <w:spacing w:after="0" w:line="260"/>
+            </w:pPr>
+            <w:r>
+              <w:rPr>
+                <w:rFonts w:ascii="Georgia" w:cs="Georgia" w:eastAsia="Georgia" w:hAnsi="Georgia"/>
+                <w:b w:val="false"/>
+                <w:bCs w:val="false"/>
+                <w:color w:val="1A1714"/>
+                <w:sz w:val="20"/>
+                <w:szCs w:val="20"/>
+              </w:rPr>
+              <w:t xml:space="preserve">Context Lock</w:t>
+            </w:r>
+          </w:p>
+        </w:tc>
+        <w:tc>
+          <w:tcPr>
+            <w:tcW w:type="dxa" w:w="3380"/>
+            <w:tcMar>
+              <w:top w:type="dxa" w:w="90"/>
+              <w:left w:type="dxa" w:w="120"/>
+              <w:bottom w:type="dxa" w:w="90"/>
+              <w:right w:type="dxa" w:w="120"/>
+            </w:tcMar>
+          </w:tcPr>
+          <w:p>
+            <w:pPr>
+              <w:spacing w:after="0" w:line="260"/>
+            </w:pPr>
+            <w:r>
+              <w:rPr>
+                <w:rFonts w:ascii="Georgia" w:cs="Georgia" w:eastAsia="Georgia" w:hAnsi="Georgia"/>
+                <w:b w:val="false"/>
+                <w:bCs w:val="false"/>
+                <w:color w:val="1A1714"/>
+                <w:sz w:val="20"/>
+                <w:szCs w:val="20"/>
+              </w:rPr>
+              <w:t xml:space="preserve">Enumerates the dimensions over which determinism is asserted</w:t>
+            </w:r>
+          </w:p>
+        </w:tc>
+        <w:tc>
+          <w:tcPr>
+            <w:tcW w:type="dxa" w:w="3380"/>
+            <w:tcMar>
+              <w:top w:type="dxa" w:w="90"/>
+              <w:left w:type="dxa" w:w="120"/>
+              <w:bottom w:type="dxa" w:w="90"/>
+              <w:right w:type="dxa" w:w="120"/>
+            </w:tcMar>
+          </w:tcPr>
+          <w:p>
+            <w:pPr>
+              <w:spacing w:after="0" w:line="260"/>
+            </w:pPr>
+            <w:r>
+              <w:rPr>
+                <w:rFonts w:ascii="Georgia" w:cs="Georgia" w:eastAsia="Georgia" w:hAnsi="Georgia"/>
+                <w:b w:val="false"/>
+                <w:bCs w:val="false"/>
+                <w:color w:val="1A1714"/>
+                <w:sz w:val="20"/>
+                <w:szCs w:val="20"/>
+              </w:rPr>
+              <w:t xml:space="preserve">Enables testable reproducibility</w:t>
+            </w:r>
+          </w:p>
+        </w:tc>
+      </w:tr>
+      <w:tr>
+        <w:tc>
+          <w:tcPr>
+            <w:tcW w:type="dxa" w:w="2600"/>
+            <w:tcMar>
+              <w:top w:type="dxa" w:w="90"/>
+              <w:left w:type="dxa" w:w="120"/>
+              <w:bottom w:type="dxa" w:w="90"/>
+              <w:right w:type="dxa" w:w="120"/>
+            </w:tcMar>
+          </w:tcPr>
+          <w:p>
+            <w:pPr>
+              <w:spacing w:after="0" w:line="260"/>
+            </w:pPr>
+            <w:r>
+              <w:rPr>
+                <w:rFonts w:ascii="Georgia" w:cs="Georgia" w:eastAsia="Georgia" w:hAnsi="Georgia"/>
+                <w:b w:val="false"/>
+                <w:bCs w:val="false"/>
+                <w:color w:val="1A1714"/>
+                <w:sz w:val="20"/>
+                <w:szCs w:val="20"/>
+              </w:rPr>
+              <w:t xml:space="preserve">Prime Directive (Domain 0)</w:t>
+            </w:r>
+          </w:p>
+        </w:tc>
+        <w:tc>
+          <w:tcPr>
+            <w:tcW w:type="dxa" w:w="3380"/>
+            <w:tcMar>
+              <w:top w:type="dxa" w:w="90"/>
+              <w:left w:type="dxa" w:w="120"/>
+              <w:bottom w:type="dxa" w:w="90"/>
+              <w:right w:type="dxa" w:w="120"/>
+            </w:tcMar>
+          </w:tcPr>
+          <w:p>
+            <w:pPr>
+              <w:spacing w:after="0" w:line="260"/>
+            </w:pPr>
+            <w:r>
+              <w:rPr>
+                <w:rFonts w:ascii="Georgia" w:cs="Georgia" w:eastAsia="Georgia" w:hAnsi="Georgia"/>
+                <w:b w:val="false"/>
+                <w:bCs w:val="false"/>
+                <w:color w:val="1A1714"/>
+                <w:sz w:val="20"/>
+                <w:szCs w:val="20"/>
+              </w:rPr>
+              <w:t xml:space="preserve">Governs every subsystem without exception</w:t>
+            </w:r>
+          </w:p>
+        </w:tc>
+        <w:tc>
+          <w:tcPr>
+            <w:tcW w:type="dxa" w:w="3380"/>
+            <w:tcMar>
+              <w:top w:type="dxa" w:w="90"/>
+              <w:left w:type="dxa" w:w="120"/>
+              <w:bottom w:type="dxa" w:w="90"/>
+              <w:right w:type="dxa" w:w="120"/>
+            </w:tcMar>
+          </w:tcPr>
+          <w:p>
+            <w:pPr>
+              <w:spacing w:after="0" w:line="260"/>
+            </w:pPr>
+            <w:r>
+              <w:rPr>
+                <w:rFonts w:ascii="Georgia" w:cs="Georgia" w:eastAsia="Georgia" w:hAnsi="Georgia"/>
+                <w:b w:val="false"/>
+                <w:bCs w:val="false"/>
+                <w:color w:val="1A1714"/>
+                <w:sz w:val="20"/>
+                <w:szCs w:val="20"/>
+              </w:rPr>
+              <w:t xml:space="preserve">Enables architectural safety</w:t>
+            </w:r>
+          </w:p>
+        </w:tc>
+      </w:tr>
+    </w:tbl>
+    <w:p>
+      <w:pPr>
+        <w:spacing w:after="260" w:before="140" w:line="290"/>
+      </w:pPr>
+      <w:r>
+        <w:rPr>
+          <w:i/>
+          <w:iCs/>
+          <w:color w:val="5F5952"/>
+          <w:sz w:val="21"/>
+          <w:szCs w:val="21"/>
+        </w:rPr>
+        <w:t xml:space="preserve">Outcome: every answer is deterministic, grounded, and verifiable — the substrate every higher level stands on.</w:t>
+      </w:r>
+    </w:p>
+    <w:p>
+      <w:pPr>
+        <w:pStyle w:val="Heading2"/>
+        <w:spacing w:after="140" w:before="280"/>
+      </w:pPr>
+      <w:r>
+        <w:rPr>
+          <w:b/>
+          <w:bCs/>
+          <w:color w:val="1A1714"/>
+          <w:sz w:val="25"/>
+          <w:szCs w:val="25"/>
+        </w:rPr>
+        <w:t xml:space="preserve">Level Two — Conceptual AI: The World-View Perspective, Built on Level One</w:t>
+      </w:r>
+    </w:p>
+    <w:tbl>
+      <w:tblPr>
+        <w:tblW w:type="dxa" w:w="9360"/>
+        <w:tblBorders>
+          <w:top w:val="single" w:color="auto" w:sz="4"/>
+          <w:left w:val="single" w:color="auto" w:sz="4"/>
+          <w:bottom w:val="single" w:color="auto" w:sz="4"/>
+          <w:right w:val="single" w:color="auto" w:sz="4"/>
+          <w:insideH w:val="single" w:color="auto" w:sz="4"/>
+          <w:insideV w:val="single" w:color="auto" w:sz="4"/>
+        </w:tblBorders>
+      </w:tblPr>
+      <w:tblGrid>
+        <w:gridCol w:w="2600"/>
+        <w:gridCol w:w="3380"/>
+        <w:gridCol w:w="3380"/>
+      </w:tblGrid>
+      <w:tr>
+        <w:trPr>
+          <w:tblHeader/>
+        </w:trPr>
+        <w:tc>
+          <w:tcPr>
+            <w:tcW w:type="dxa" w:w="2600"/>
+            <w:shd w:fill="F0ECE5" w:color="auto" w:val="clear"/>
+            <w:tcMar>
+              <w:top w:type="dxa" w:w="90"/>
+              <w:left w:type="dxa" w:w="120"/>
+              <w:bottom w:type="dxa" w:w="90"/>
+              <w:right w:type="dxa" w:w="120"/>
+            </w:tcMar>
+          </w:tcPr>
+          <w:p>
+            <w:pPr>
+              <w:spacing w:after="0" w:line="260"/>
+            </w:pPr>
+            <w:r>
+              <w:rPr>
+                <w:rFonts w:ascii="Arial" w:cs="Arial" w:eastAsia="Arial" w:hAnsi="Arial"/>
+                <w:b/>
+                <w:bCs/>
+                <w:color w:val="1A1714"/>
+                <w:sz w:val="19"/>
+                <w:szCs w:val="19"/>
+              </w:rPr>
+              <w:t xml:space="preserve">Subsystem</w:t>
+            </w:r>
+          </w:p>
+        </w:tc>
+        <w:tc>
+          <w:tcPr>
+            <w:tcW w:type="dxa" w:w="3380"/>
+            <w:shd w:fill="F0ECE5" w:color="auto" w:val="clear"/>
+            <w:tcMar>
+              <w:top w:type="dxa" w:w="90"/>
+              <w:left w:type="dxa" w:w="120"/>
+              <w:bottom w:type="dxa" w:w="90"/>
+              <w:right w:type="dxa" w:w="120"/>
+            </w:tcMar>
+          </w:tcPr>
+          <w:p>
+            <w:pPr>
+              <w:spacing w:after="0" w:line="260"/>
+            </w:pPr>
+            <w:r>
+              <w:rPr>
+                <w:rFonts w:ascii="Arial" w:cs="Arial" w:eastAsia="Arial" w:hAnsi="Arial"/>
+                <w:b/>
+                <w:bCs/>
+                <w:color w:val="1A1714"/>
+                <w:sz w:val="19"/>
+                <w:szCs w:val="19"/>
+              </w:rPr>
+              <w:t xml:space="preserve">Function</w:t>
+            </w:r>
+          </w:p>
+        </w:tc>
+        <w:tc>
+          <w:tcPr>
+            <w:tcW w:type="dxa" w:w="3380"/>
+            <w:shd w:fill="F0ECE5" w:color="auto" w:val="clear"/>
+            <w:tcMar>
+              <w:top w:type="dxa" w:w="90"/>
+              <w:left w:type="dxa" w:w="120"/>
+              <w:bottom w:type="dxa" w:w="90"/>
+              <w:right w:type="dxa" w:w="120"/>
+            </w:tcMar>
+          </w:tcPr>
+          <w:p>
+            <w:pPr>
+              <w:spacing w:after="0" w:line="260"/>
+            </w:pPr>
+            <w:r>
+              <w:rPr>
+                <w:rFonts w:ascii="Arial" w:cs="Arial" w:eastAsia="Arial" w:hAnsi="Arial"/>
+                <w:b/>
+                <w:bCs/>
+                <w:color w:val="1A1714"/>
+                <w:sz w:val="19"/>
+                <w:szCs w:val="19"/>
+              </w:rPr>
+              <w:t xml:space="preserve">Advancement</w:t>
+            </w:r>
+          </w:p>
+        </w:tc>
+      </w:tr>
+      <w:tr>
+        <w:tc>
+          <w:tcPr>
+            <w:tcW w:type="dxa" w:w="2600"/>
+            <w:tcMar>
+              <w:top w:type="dxa" w:w="90"/>
+              <w:left w:type="dxa" w:w="120"/>
+              <w:bottom w:type="dxa" w:w="90"/>
+              <w:right w:type="dxa" w:w="120"/>
+            </w:tcMar>
+          </w:tcPr>
+          <w:p>
+            <w:pPr>
+              <w:spacing w:after="0" w:line="260"/>
+            </w:pPr>
+            <w:r>
+              <w:rPr>
+                <w:rFonts w:ascii="Georgia" w:cs="Georgia" w:eastAsia="Georgia" w:hAnsi="Georgia"/>
+                <w:b w:val="false"/>
+                <w:bCs w:val="false"/>
+                <w:color w:val="1A1714"/>
+                <w:sz w:val="20"/>
+                <w:szCs w:val="20"/>
+              </w:rPr>
+              <w:t xml:space="preserve">World-View Model</w:t>
+            </w:r>
+          </w:p>
+        </w:tc>
+        <w:tc>
+          <w:tcPr>
+            <w:tcW w:type="dxa" w:w="3380"/>
+            <w:tcMar>
+              <w:top w:type="dxa" w:w="90"/>
+              <w:left w:type="dxa" w:w="120"/>
+              <w:bottom w:type="dxa" w:w="90"/>
+              <w:right w:type="dxa" w:w="120"/>
+            </w:tcMar>
+          </w:tcPr>
+          <w:p>
+            <w:pPr>
+              <w:spacing w:after="0" w:line="260"/>
+            </w:pPr>
+            <w:r>
+              <w:rPr>
+                <w:rFonts w:ascii="Georgia" w:cs="Georgia" w:eastAsia="Georgia" w:hAnsi="Georgia"/>
+                <w:b w:val="false"/>
+                <w:bCs w:val="false"/>
+                <w:color w:val="1A1714"/>
+                <w:sz w:val="20"/>
+                <w:szCs w:val="20"/>
+              </w:rPr>
+              <w:t xml:space="preserve">Builds causal, spatial, and physical understanding</w:t>
+            </w:r>
+          </w:p>
+        </w:tc>
+        <w:tc>
+          <w:tcPr>
+            <w:tcW w:type="dxa" w:w="3380"/>
+            <w:tcMar>
+              <w:top w:type="dxa" w:w="90"/>
+              <w:left w:type="dxa" w:w="120"/>
+              <w:bottom w:type="dxa" w:w="90"/>
+              <w:right w:type="dxa" w:w="120"/>
+            </w:tcMar>
+          </w:tcPr>
+          <w:p>
+            <w:pPr>
+              <w:spacing w:after="0" w:line="260"/>
+            </w:pPr>
+            <w:r>
+              <w:rPr>
+                <w:rFonts w:ascii="Georgia" w:cs="Georgia" w:eastAsia="Georgia" w:hAnsi="Georgia"/>
+                <w:b w:val="false"/>
+                <w:bCs w:val="false"/>
+                <w:color w:val="1A1714"/>
+                <w:sz w:val="20"/>
+                <w:szCs w:val="20"/>
+              </w:rPr>
+              <w:t xml:space="preserve">Adds physics-like reasoning</w:t>
+            </w:r>
+          </w:p>
+        </w:tc>
+      </w:tr>
+      <w:tr>
+        <w:tc>
+          <w:tcPr>
+            <w:tcW w:type="dxa" w:w="2600"/>
+            <w:tcMar>
+              <w:top w:type="dxa" w:w="90"/>
+              <w:left w:type="dxa" w:w="120"/>
+              <w:bottom w:type="dxa" w:w="90"/>
+              <w:right w:type="dxa" w:w="120"/>
+            </w:tcMar>
+          </w:tcPr>
+          <w:p>
+            <w:pPr>
+              <w:spacing w:after="0" w:line="260"/>
+            </w:pPr>
+            <w:r>
+              <w:rPr>
+                <w:rFonts w:ascii="Georgia" w:cs="Georgia" w:eastAsia="Georgia" w:hAnsi="Georgia"/>
+                <w:b w:val="false"/>
+                <w:bCs w:val="false"/>
+                <w:color w:val="1A1714"/>
+                <w:sz w:val="20"/>
+                <w:szCs w:val="20"/>
+              </w:rPr>
+              <w:t xml:space="preserve">Conceptual Memory (World Brain concept nodes)</w:t>
+            </w:r>
+          </w:p>
+        </w:tc>
+        <w:tc>
+          <w:tcPr>
+            <w:tcW w:type="dxa" w:w="3380"/>
+            <w:tcMar>
+              <w:top w:type="dxa" w:w="90"/>
+              <w:left w:type="dxa" w:w="120"/>
+              <w:bottom w:type="dxa" w:w="90"/>
+              <w:right w:type="dxa" w:w="120"/>
+            </w:tcMar>
+          </w:tcPr>
+          <w:p>
+            <w:pPr>
+              <w:spacing w:after="0" w:line="260"/>
+            </w:pPr>
+            <w:r>
+              <w:rPr>
+                <w:rFonts w:ascii="Georgia" w:cs="Georgia" w:eastAsia="Georgia" w:hAnsi="Georgia"/>
+                <w:b w:val="false"/>
+                <w:bCs w:val="false"/>
+                <w:color w:val="1A1714"/>
+                <w:sz w:val="20"/>
+                <w:szCs w:val="20"/>
+              </w:rPr>
+              <w:t xml:space="preserve">Stores abstract concepts and schemas</w:t>
+            </w:r>
+          </w:p>
+        </w:tc>
+        <w:tc>
+          <w:tcPr>
+            <w:tcW w:type="dxa" w:w="3380"/>
+            <w:tcMar>
+              <w:top w:type="dxa" w:w="90"/>
+              <w:left w:type="dxa" w:w="120"/>
+              <w:bottom w:type="dxa" w:w="90"/>
+              <w:right w:type="dxa" w:w="120"/>
+            </w:tcMar>
+          </w:tcPr>
+          <w:p>
+            <w:pPr>
+              <w:spacing w:after="0" w:line="260"/>
+            </w:pPr>
+            <w:r>
+              <w:rPr>
+                <w:rFonts w:ascii="Georgia" w:cs="Georgia" w:eastAsia="Georgia" w:hAnsi="Georgia"/>
+                <w:b w:val="false"/>
+                <w:bCs w:val="false"/>
+                <w:color w:val="1A1714"/>
+                <w:sz w:val="20"/>
+                <w:szCs w:val="20"/>
+              </w:rPr>
+              <w:t xml:space="preserve">Enables concept formation</w:t>
+            </w:r>
+          </w:p>
+        </w:tc>
+      </w:tr>
+      <w:tr>
+        <w:tc>
+          <w:tcPr>
+            <w:tcW w:type="dxa" w:w="2600"/>
+            <w:tcMar>
+              <w:top w:type="dxa" w:w="90"/>
+              <w:left w:type="dxa" w:w="120"/>
+              <w:bottom w:type="dxa" w:w="90"/>
+              <w:right w:type="dxa" w:w="120"/>
+            </w:tcMar>
+          </w:tcPr>
+          <w:p>
+            <w:pPr>
+              <w:spacing w:after="0" w:line="260"/>
+            </w:pPr>
+            <w:r>
+              <w:rPr>
+                <w:rFonts w:ascii="Georgia" w:cs="Georgia" w:eastAsia="Georgia" w:hAnsi="Georgia"/>
+                <w:b w:val="false"/>
+                <w:bCs w:val="false"/>
+                <w:color w:val="1A1714"/>
+                <w:sz w:val="20"/>
+                <w:szCs w:val="20"/>
+              </w:rPr>
+              <w:t xml:space="preserve">Skill Inventory Layer</w:t>
+            </w:r>
+          </w:p>
+        </w:tc>
+        <w:tc>
+          <w:tcPr>
+            <w:tcW w:type="dxa" w:w="3380"/>
+            <w:tcMar>
+              <w:top w:type="dxa" w:w="90"/>
+              <w:left w:type="dxa" w:w="120"/>
+              <w:bottom w:type="dxa" w:w="90"/>
+              <w:right w:type="dxa" w:w="120"/>
+            </w:tcMar>
+          </w:tcPr>
+          <w:p>
+            <w:pPr>
+              <w:spacing w:after="0" w:line="260"/>
+            </w:pPr>
+            <w:r>
+              <w:rPr>
+                <w:rFonts w:ascii="Georgia" w:cs="Georgia" w:eastAsia="Georgia" w:hAnsi="Georgia"/>
+                <w:b w:val="false"/>
+                <w:bCs w:val="false"/>
+                <w:color w:val="1A1714"/>
+                <w:sz w:val="20"/>
+                <w:szCs w:val="20"/>
+              </w:rPr>
+              <w:t xml:space="preserve">Encodes procedural knowledge</w:t>
+            </w:r>
+          </w:p>
+        </w:tc>
+        <w:tc>
+          <w:tcPr>
+            <w:tcW w:type="dxa" w:w="3380"/>
+            <w:tcMar>
+              <w:top w:type="dxa" w:w="90"/>
+              <w:left w:type="dxa" w:w="120"/>
+              <w:bottom w:type="dxa" w:w="90"/>
+              <w:right w:type="dxa" w:w="120"/>
+            </w:tcMar>
+          </w:tcPr>
+          <w:p>
+            <w:pPr>
+              <w:spacing w:after="0" w:line="260"/>
+            </w:pPr>
+            <w:r>
+              <w:rPr>
+                <w:rFonts w:ascii="Georgia" w:cs="Georgia" w:eastAsia="Georgia" w:hAnsi="Georgia"/>
+                <w:b w:val="false"/>
+                <w:bCs w:val="false"/>
+                <w:color w:val="1A1714"/>
+                <w:sz w:val="20"/>
+                <w:szCs w:val="20"/>
+              </w:rPr>
+              <w:t xml:space="preserve">Enables action learning</w:t>
+            </w:r>
+          </w:p>
+        </w:tc>
+      </w:tr>
+      <w:tr>
+        <w:tc>
+          <w:tcPr>
+            <w:tcW w:type="dxa" w:w="2600"/>
+            <w:tcMar>
+              <w:top w:type="dxa" w:w="90"/>
+              <w:left w:type="dxa" w:w="120"/>
+              <w:bottom w:type="dxa" w:w="90"/>
+              <w:right w:type="dxa" w:w="120"/>
+            </w:tcMar>
+          </w:tcPr>
+          <w:p>
+            <w:pPr>
+              <w:spacing w:after="0" w:line="260"/>
+            </w:pPr>
+            <w:r>
+              <w:rPr>
+                <w:rFonts w:ascii="Georgia" w:cs="Georgia" w:eastAsia="Georgia" w:hAnsi="Georgia"/>
+                <w:b w:val="false"/>
+                <w:bCs w:val="false"/>
+                <w:color w:val="1A1714"/>
+                <w:sz w:val="20"/>
+                <w:szCs w:val="20"/>
+              </w:rPr>
+              <w:t xml:space="preserve">Noise Elimination Process</w:t>
+            </w:r>
+          </w:p>
+        </w:tc>
+        <w:tc>
+          <w:tcPr>
+            <w:tcW w:type="dxa" w:w="3380"/>
+            <w:tcMar>
+              <w:top w:type="dxa" w:w="90"/>
+              <w:left w:type="dxa" w:w="120"/>
+              <w:bottom w:type="dxa" w:w="90"/>
+              <w:right w:type="dxa" w:w="120"/>
+            </w:tcMar>
+          </w:tcPr>
+          <w:p>
+            <w:pPr>
+              <w:spacing w:after="0" w:line="260"/>
+            </w:pPr>
+            <w:r>
+              <w:rPr>
+                <w:rFonts w:ascii="Georgia" w:cs="Georgia" w:eastAsia="Georgia" w:hAnsi="Georgia"/>
+                <w:b w:val="false"/>
+                <w:bCs w:val="false"/>
+                <w:color w:val="1A1714"/>
+                <w:sz w:val="20"/>
+                <w:szCs w:val="20"/>
+              </w:rPr>
+              <w:t xml:space="preserve">Removes redundant episodes</w:t>
+            </w:r>
+          </w:p>
+        </w:tc>
+        <w:tc>
+          <w:tcPr>
+            <w:tcW w:type="dxa" w:w="3380"/>
+            <w:tcMar>
+              <w:top w:type="dxa" w:w="90"/>
+              <w:left w:type="dxa" w:w="120"/>
+              <w:bottom w:type="dxa" w:w="90"/>
+              <w:right w:type="dxa" w:w="120"/>
+            </w:tcMar>
+          </w:tcPr>
+          <w:p>
+            <w:pPr>
+              <w:spacing w:after="0" w:line="260"/>
+            </w:pPr>
+            <w:r>
+              <w:rPr>
+                <w:rFonts w:ascii="Georgia" w:cs="Georgia" w:eastAsia="Georgia" w:hAnsi="Georgia"/>
+                <w:b w:val="false"/>
+                <w:bCs w:val="false"/>
+                <w:color w:val="1A1714"/>
+                <w:sz w:val="20"/>
+                <w:szCs w:val="20"/>
+              </w:rPr>
+              <w:t xml:space="preserve">Enables concept compression</w:t>
+            </w:r>
+          </w:p>
+        </w:tc>
+      </w:tr>
+      <w:tr>
+        <w:tc>
+          <w:tcPr>
+            <w:tcW w:type="dxa" w:w="2600"/>
+            <w:tcMar>
+              <w:top w:type="dxa" w:w="90"/>
+              <w:left w:type="dxa" w:w="120"/>
+              <w:bottom w:type="dxa" w:w="90"/>
+              <w:right w:type="dxa" w:w="120"/>
+            </w:tcMar>
+          </w:tcPr>
+          <w:p>
+            <w:pPr>
+              <w:spacing w:after="0" w:line="260"/>
+            </w:pPr>
+            <w:r>
+              <w:rPr>
+                <w:rFonts w:ascii="Georgia" w:cs="Georgia" w:eastAsia="Georgia" w:hAnsi="Georgia"/>
+                <w:b w:val="false"/>
+                <w:bCs w:val="false"/>
+                <w:color w:val="1A1714"/>
+                <w:sz w:val="20"/>
+                <w:szCs w:val="20"/>
+              </w:rPr>
+              <w:t xml:space="preserve">Multimodal Ingestion</w:t>
+            </w:r>
+          </w:p>
+        </w:tc>
+        <w:tc>
+          <w:tcPr>
+            <w:tcW w:type="dxa" w:w="3380"/>
+            <w:tcMar>
+              <w:top w:type="dxa" w:w="90"/>
+              <w:left w:type="dxa" w:w="120"/>
+              <w:bottom w:type="dxa" w:w="90"/>
+              <w:right w:type="dxa" w:w="120"/>
+            </w:tcMar>
+          </w:tcPr>
+          <w:p>
+            <w:pPr>
+              <w:spacing w:after="0" w:line="260"/>
+            </w:pPr>
+            <w:r>
+              <w:rPr>
+                <w:rFonts w:ascii="Georgia" w:cs="Georgia" w:eastAsia="Georgia" w:hAnsi="Georgia"/>
+                <w:b w:val="false"/>
+                <w:bCs w:val="false"/>
+                <w:color w:val="1A1714"/>
+                <w:sz w:val="20"/>
+                <w:szCs w:val="20"/>
+              </w:rPr>
+              <w:t xml:space="preserve">Converts sensory experience across eight modalities into one substrate</w:t>
+            </w:r>
+          </w:p>
+        </w:tc>
+        <w:tc>
+          <w:tcPr>
+            <w:tcW w:type="dxa" w:w="3380"/>
+            <w:tcMar>
+              <w:top w:type="dxa" w:w="90"/>
+              <w:left w:type="dxa" w:w="120"/>
+              <w:bottom w:type="dxa" w:w="90"/>
+              <w:right w:type="dxa" w:w="120"/>
+            </w:tcMar>
+          </w:tcPr>
+          <w:p>
+            <w:pPr>
+              <w:spacing w:after="0" w:line="260"/>
+            </w:pPr>
+            <w:r>
+              <w:rPr>
+                <w:rFonts w:ascii="Georgia" w:cs="Georgia" w:eastAsia="Georgia" w:hAnsi="Georgia"/>
+                <w:b w:val="false"/>
+                <w:bCs w:val="false"/>
+                <w:color w:val="1A1714"/>
+                <w:sz w:val="20"/>
+                <w:szCs w:val="20"/>
+              </w:rPr>
+              <w:t xml:space="preserve">Enables perception-first learning</w:t>
+            </w:r>
+          </w:p>
+        </w:tc>
+      </w:tr>
+    </w:tbl>
+    <w:p>
+      <w:pPr>
+        <w:spacing w:after="260" w:before="140" w:line="290"/>
+      </w:pPr>
+      <w:r>
+        <w:rPr>
+          <w:i/>
+          <w:iCs/>
+          <w:color w:val="5F5952"/>
+          <w:sz w:val="21"/>
+          <w:szCs w:val="21"/>
+        </w:rPr>
+        <w:t xml:space="preserve">Outcome: QueryBook now learns concepts, not examples — the first step toward cognition.</w:t>
+      </w:r>
+    </w:p>
+    <w:p>
+      <w:pPr>
+        <w:pStyle w:val="Heading2"/>
+        <w:spacing w:after="140" w:before="280"/>
+      </w:pPr>
+      <w:r>
+        <w:rPr>
+          <w:b/>
+          <w:bCs/>
+          <w:color w:val="1A1714"/>
+          <w:sz w:val="25"/>
+          <w:szCs w:val="25"/>
+        </w:rPr>
+        <w:t xml:space="preserve">Level Three — Integrative Intelligence</w:t>
+      </w:r>
+    </w:p>
+    <w:tbl>
+      <w:tblPr>
+        <w:tblW w:type="dxa" w:w="9360"/>
+        <w:tblBorders>
+          <w:top w:val="single" w:color="auto" w:sz="4"/>
+          <w:left w:val="single" w:color="auto" w:sz="4"/>
+          <w:bottom w:val="single" w:color="auto" w:sz="4"/>
+          <w:right w:val="single" w:color="auto" w:sz="4"/>
+          <w:insideH w:val="single" w:color="auto" w:sz="4"/>
+          <w:insideV w:val="single" w:color="auto" w:sz="4"/>
+        </w:tblBorders>
+      </w:tblPr>
+      <w:tblGrid>
+        <w:gridCol w:w="2600"/>
+        <w:gridCol w:w="3380"/>
+        <w:gridCol w:w="3380"/>
+      </w:tblGrid>
+      <w:tr>
+        <w:trPr>
+          <w:tblHeader/>
+        </w:trPr>
+        <w:tc>
+          <w:tcPr>
+            <w:tcW w:type="dxa" w:w="2600"/>
+            <w:shd w:fill="F0ECE5" w:color="auto" w:val="clear"/>
+            <w:tcMar>
+              <w:top w:type="dxa" w:w="90"/>
+              <w:left w:type="dxa" w:w="120"/>
+              <w:bottom w:type="dxa" w:w="90"/>
+              <w:right w:type="dxa" w:w="120"/>
+            </w:tcMar>
+          </w:tcPr>
+          <w:p>
+            <w:pPr>
+              <w:spacing w:after="0" w:line="260"/>
+            </w:pPr>
+            <w:r>
+              <w:rPr>
+                <w:rFonts w:ascii="Arial" w:cs="Arial" w:eastAsia="Arial" w:hAnsi="Arial"/>
+                <w:b/>
+                <w:bCs/>
+                <w:color w:val="1A1714"/>
+                <w:sz w:val="19"/>
+                <w:szCs w:val="19"/>
+              </w:rPr>
+              <w:t xml:space="preserve">Subsystem</w:t>
+            </w:r>
+          </w:p>
+        </w:tc>
+        <w:tc>
+          <w:tcPr>
+            <w:tcW w:type="dxa" w:w="3380"/>
+            <w:shd w:fill="F0ECE5" w:color="auto" w:val="clear"/>
+            <w:tcMar>
+              <w:top w:type="dxa" w:w="90"/>
+              <w:left w:type="dxa" w:w="120"/>
+              <w:bottom w:type="dxa" w:w="90"/>
+              <w:right w:type="dxa" w:w="120"/>
+            </w:tcMar>
+          </w:tcPr>
+          <w:p>
+            <w:pPr>
+              <w:spacing w:after="0" w:line="260"/>
+            </w:pPr>
+            <w:r>
+              <w:rPr>
+                <w:rFonts w:ascii="Arial" w:cs="Arial" w:eastAsia="Arial" w:hAnsi="Arial"/>
+                <w:b/>
+                <w:bCs/>
+                <w:color w:val="1A1714"/>
+                <w:sz w:val="19"/>
+                <w:szCs w:val="19"/>
+              </w:rPr>
+              <w:t xml:space="preserve">Function</w:t>
+            </w:r>
+          </w:p>
+        </w:tc>
+        <w:tc>
+          <w:tcPr>
+            <w:tcW w:type="dxa" w:w="3380"/>
+            <w:shd w:fill="F0ECE5" w:color="auto" w:val="clear"/>
+            <w:tcMar>
+              <w:top w:type="dxa" w:w="90"/>
+              <w:left w:type="dxa" w:w="120"/>
+              <w:bottom w:type="dxa" w:w="90"/>
+              <w:right w:type="dxa" w:w="120"/>
+            </w:tcMar>
+          </w:tcPr>
+          <w:p>
+            <w:pPr>
+              <w:spacing w:after="0" w:line="260"/>
+            </w:pPr>
+            <w:r>
+              <w:rPr>
+                <w:rFonts w:ascii="Arial" w:cs="Arial" w:eastAsia="Arial" w:hAnsi="Arial"/>
+                <w:b/>
+                <w:bCs/>
+                <w:color w:val="1A1714"/>
+                <w:sz w:val="19"/>
+                <w:szCs w:val="19"/>
+              </w:rPr>
+              <w:t xml:space="preserve">Advancement</w:t>
+            </w:r>
+          </w:p>
+        </w:tc>
+      </w:tr>
+      <w:tr>
+        <w:tc>
+          <w:tcPr>
+            <w:tcW w:type="dxa" w:w="2600"/>
+            <w:tcMar>
+              <w:top w:type="dxa" w:w="90"/>
+              <w:left w:type="dxa" w:w="120"/>
+              <w:bottom w:type="dxa" w:w="90"/>
+              <w:right w:type="dxa" w:w="120"/>
+            </w:tcMar>
+          </w:tcPr>
+          <w:p>
+            <w:pPr>
+              <w:spacing w:after="0" w:line="260"/>
+            </w:pPr>
+            <w:r>
+              <w:rPr>
+                <w:rFonts w:ascii="Georgia" w:cs="Georgia" w:eastAsia="Georgia" w:hAnsi="Georgia"/>
+                <w:b w:val="false"/>
+                <w:bCs w:val="false"/>
+                <w:color w:val="1A1714"/>
+                <w:sz w:val="20"/>
+                <w:szCs w:val="20"/>
+              </w:rPr>
+              <w:t xml:space="preserve">Perspective Modeling Layer</w:t>
+            </w:r>
+          </w:p>
+        </w:tc>
+        <w:tc>
+          <w:tcPr>
+            <w:tcW w:type="dxa" w:w="3380"/>
+            <w:tcMar>
+              <w:top w:type="dxa" w:w="90"/>
+              <w:left w:type="dxa" w:w="120"/>
+              <w:bottom w:type="dxa" w:w="90"/>
+              <w:right w:type="dxa" w:w="120"/>
+            </w:tcMar>
+          </w:tcPr>
+          <w:p>
+            <w:pPr>
+              <w:spacing w:after="0" w:line="260"/>
+            </w:pPr>
+            <w:r>
+              <w:rPr>
+                <w:rFonts w:ascii="Georgia" w:cs="Georgia" w:eastAsia="Georgia" w:hAnsi="Georgia"/>
+                <w:b w:val="false"/>
+                <w:bCs w:val="false"/>
+                <w:color w:val="1A1714"/>
+                <w:sz w:val="20"/>
+                <w:szCs w:val="20"/>
+              </w:rPr>
+              <w:t xml:space="preserve">Models other minds and intent</w:t>
+            </w:r>
+          </w:p>
+        </w:tc>
+        <w:tc>
+          <w:tcPr>
+            <w:tcW w:type="dxa" w:w="3380"/>
+            <w:tcMar>
+              <w:top w:type="dxa" w:w="90"/>
+              <w:left w:type="dxa" w:w="120"/>
+              <w:bottom w:type="dxa" w:w="90"/>
+              <w:right w:type="dxa" w:w="120"/>
+            </w:tcMar>
+          </w:tcPr>
+          <w:p>
+            <w:pPr>
+              <w:spacing w:after="0" w:line="260"/>
+            </w:pPr>
+            <w:r>
+              <w:rPr>
+                <w:rFonts w:ascii="Georgia" w:cs="Georgia" w:eastAsia="Georgia" w:hAnsi="Georgia"/>
+                <w:b w:val="false"/>
+                <w:bCs w:val="false"/>
+                <w:color w:val="1A1714"/>
+                <w:sz w:val="20"/>
+                <w:szCs w:val="20"/>
+              </w:rPr>
+              <w:t xml:space="preserve">Enables empathy and social reasoning</w:t>
+            </w:r>
+          </w:p>
+        </w:tc>
+      </w:tr>
+      <w:tr>
+        <w:tc>
+          <w:tcPr>
+            <w:tcW w:type="dxa" w:w="2600"/>
+            <w:tcMar>
+              <w:top w:type="dxa" w:w="90"/>
+              <w:left w:type="dxa" w:w="120"/>
+              <w:bottom w:type="dxa" w:w="90"/>
+              <w:right w:type="dxa" w:w="120"/>
+            </w:tcMar>
+          </w:tcPr>
+          <w:p>
+            <w:pPr>
+              <w:spacing w:after="0" w:line="260"/>
+            </w:pPr>
+            <w:r>
+              <w:rPr>
+                <w:rFonts w:ascii="Georgia" w:cs="Georgia" w:eastAsia="Georgia" w:hAnsi="Georgia"/>
+                <w:b w:val="false"/>
+                <w:bCs w:val="false"/>
+                <w:color w:val="1A1714"/>
+                <w:sz w:val="20"/>
+                <w:szCs w:val="20"/>
+              </w:rPr>
+              <w:t xml:space="preserve">Self-Model Layer</w:t>
+            </w:r>
+          </w:p>
+        </w:tc>
+        <w:tc>
+          <w:tcPr>
+            <w:tcW w:type="dxa" w:w="3380"/>
+            <w:tcMar>
+              <w:top w:type="dxa" w:w="90"/>
+              <w:left w:type="dxa" w:w="120"/>
+              <w:bottom w:type="dxa" w:w="90"/>
+              <w:right w:type="dxa" w:w="120"/>
+            </w:tcMar>
+          </w:tcPr>
+          <w:p>
+            <w:pPr>
+              <w:spacing w:after="0" w:line="260"/>
+            </w:pPr>
+            <w:r>
+              <w:rPr>
+                <w:rFonts w:ascii="Georgia" w:cs="Georgia" w:eastAsia="Georgia" w:hAnsi="Georgia"/>
+                <w:b w:val="false"/>
+                <w:bCs w:val="false"/>
+                <w:color w:val="1A1714"/>
+                <w:sz w:val="20"/>
+                <w:szCs w:val="20"/>
+              </w:rPr>
+              <w:t xml:space="preserve">Tracks its own knowledge and limits</w:t>
+            </w:r>
+          </w:p>
+        </w:tc>
+        <w:tc>
+          <w:tcPr>
+            <w:tcW w:type="dxa" w:w="3380"/>
+            <w:tcMar>
+              <w:top w:type="dxa" w:w="90"/>
+              <w:left w:type="dxa" w:w="120"/>
+              <w:bottom w:type="dxa" w:w="90"/>
+              <w:right w:type="dxa" w:w="120"/>
+            </w:tcMar>
+          </w:tcPr>
+          <w:p>
+            <w:pPr>
+              <w:spacing w:after="0" w:line="260"/>
+            </w:pPr>
+            <w:r>
+              <w:rPr>
+                <w:rFonts w:ascii="Georgia" w:cs="Georgia" w:eastAsia="Georgia" w:hAnsi="Georgia"/>
+                <w:b w:val="false"/>
+                <w:bCs w:val="false"/>
+                <w:color w:val="1A1714"/>
+                <w:sz w:val="20"/>
+                <w:szCs w:val="20"/>
+              </w:rPr>
+              <w:t xml:space="preserve">Enables introspection and self-correction</w:t>
+            </w:r>
+          </w:p>
+        </w:tc>
+      </w:tr>
+      <w:tr>
+        <w:tc>
+          <w:tcPr>
+            <w:tcW w:type="dxa" w:w="2600"/>
+            <w:tcMar>
+              <w:top w:type="dxa" w:w="90"/>
+              <w:left w:type="dxa" w:w="120"/>
+              <w:bottom w:type="dxa" w:w="90"/>
+              <w:right w:type="dxa" w:w="120"/>
+            </w:tcMar>
+          </w:tcPr>
+          <w:p>
+            <w:pPr>
+              <w:spacing w:after="0" w:line="260"/>
+            </w:pPr>
+            <w:r>
+              <w:rPr>
+                <w:rFonts w:ascii="Georgia" w:cs="Georgia" w:eastAsia="Georgia" w:hAnsi="Georgia"/>
+                <w:b w:val="false"/>
+                <w:bCs w:val="false"/>
+                <w:color w:val="1A1714"/>
+                <w:sz w:val="20"/>
+                <w:szCs w:val="20"/>
+              </w:rPr>
+              <w:t xml:space="preserve">Analogy Engine</w:t>
+            </w:r>
+          </w:p>
+        </w:tc>
+        <w:tc>
+          <w:tcPr>
+            <w:tcW w:type="dxa" w:w="3380"/>
+            <w:tcMar>
+              <w:top w:type="dxa" w:w="90"/>
+              <w:left w:type="dxa" w:w="120"/>
+              <w:bottom w:type="dxa" w:w="90"/>
+              <w:right w:type="dxa" w:w="120"/>
+            </w:tcMar>
+          </w:tcPr>
+          <w:p>
+            <w:pPr>
+              <w:spacing w:after="0" w:line="260"/>
+            </w:pPr>
+            <w:r>
+              <w:rPr>
+                <w:rFonts w:ascii="Georgia" w:cs="Georgia" w:eastAsia="Georgia" w:hAnsi="Georgia"/>
+                <w:b w:val="false"/>
+                <w:bCs w:val="false"/>
+                <w:color w:val="1A1714"/>
+                <w:sz w:val="20"/>
+                <w:szCs w:val="20"/>
+              </w:rPr>
+              <w:t xml:space="preserve">Maps structure across domains</w:t>
+            </w:r>
+          </w:p>
+        </w:tc>
+        <w:tc>
+          <w:tcPr>
+            <w:tcW w:type="dxa" w:w="3380"/>
+            <w:tcMar>
+              <w:top w:type="dxa" w:w="90"/>
+              <w:left w:type="dxa" w:w="120"/>
+              <w:bottom w:type="dxa" w:w="90"/>
+              <w:right w:type="dxa" w:w="120"/>
+            </w:tcMar>
+          </w:tcPr>
+          <w:p>
+            <w:pPr>
+              <w:spacing w:after="0" w:line="260"/>
+            </w:pPr>
+            <w:r>
+              <w:rPr>
+                <w:rFonts w:ascii="Georgia" w:cs="Georgia" w:eastAsia="Georgia" w:hAnsi="Georgia"/>
+                <w:b w:val="false"/>
+                <w:bCs w:val="false"/>
+                <w:color w:val="1A1714"/>
+                <w:sz w:val="20"/>
+                <w:szCs w:val="20"/>
+              </w:rPr>
+              <w:t xml:space="preserve">Enables creativity and generalization</w:t>
+            </w:r>
+          </w:p>
+        </w:tc>
+      </w:tr>
+      <w:tr>
+        <w:tc>
+          <w:tcPr>
+            <w:tcW w:type="dxa" w:w="2600"/>
+            <w:tcMar>
+              <w:top w:type="dxa" w:w="90"/>
+              <w:left w:type="dxa" w:w="120"/>
+              <w:bottom w:type="dxa" w:w="90"/>
+              <w:right w:type="dxa" w:w="120"/>
+            </w:tcMar>
+          </w:tcPr>
+          <w:p>
+            <w:pPr>
+              <w:spacing w:after="0" w:line="260"/>
+            </w:pPr>
+            <w:r>
+              <w:rPr>
+                <w:rFonts w:ascii="Georgia" w:cs="Georgia" w:eastAsia="Georgia" w:hAnsi="Georgia"/>
+                <w:b w:val="false"/>
+                <w:bCs w:val="false"/>
+                <w:color w:val="1A1714"/>
+                <w:sz w:val="20"/>
+                <w:szCs w:val="20"/>
+              </w:rPr>
+              <w:t xml:space="preserve">Predictive Cognitive Architecture</w:t>
+            </w:r>
+          </w:p>
+        </w:tc>
+        <w:tc>
+          <w:tcPr>
+            <w:tcW w:type="dxa" w:w="3380"/>
+            <w:tcMar>
+              <w:top w:type="dxa" w:w="90"/>
+              <w:left w:type="dxa" w:w="120"/>
+              <w:bottom w:type="dxa" w:w="90"/>
+              <w:right w:type="dxa" w:w="120"/>
+            </w:tcMar>
+          </w:tcPr>
+          <w:p>
+            <w:pPr>
+              <w:spacing w:after="0" w:line="260"/>
+            </w:pPr>
+            <w:r>
+              <w:rPr>
+                <w:rFonts w:ascii="Georgia" w:cs="Georgia" w:eastAsia="Georgia" w:hAnsi="Georgia"/>
+                <w:b w:val="false"/>
+                <w:bCs w:val="false"/>
+                <w:color w:val="1A1714"/>
+                <w:sz w:val="20"/>
+                <w:szCs w:val="20"/>
+              </w:rPr>
+              <w:t xml:space="preserve">Forecasts outcomes across fifteen coordinated prediction mechanisms</w:t>
+            </w:r>
+          </w:p>
+        </w:tc>
+        <w:tc>
+          <w:tcPr>
+            <w:tcW w:type="dxa" w:w="3380"/>
+            <w:tcMar>
+              <w:top w:type="dxa" w:w="90"/>
+              <w:left w:type="dxa" w:w="120"/>
+              <w:bottom w:type="dxa" w:w="90"/>
+              <w:right w:type="dxa" w:w="120"/>
+            </w:tcMar>
+          </w:tcPr>
+          <w:p>
+            <w:pPr>
+              <w:spacing w:after="0" w:line="260"/>
+            </w:pPr>
+            <w:r>
+              <w:rPr>
+                <w:rFonts w:ascii="Georgia" w:cs="Georgia" w:eastAsia="Georgia" w:hAnsi="Georgia"/>
+                <w:b w:val="false"/>
+                <w:bCs w:val="false"/>
+                <w:color w:val="1A1714"/>
+                <w:sz w:val="20"/>
+                <w:szCs w:val="20"/>
+              </w:rPr>
+              <w:t xml:space="preserve">Enables anticipation and planning</w:t>
+            </w:r>
+          </w:p>
+        </w:tc>
+      </w:tr>
+      <w:tr>
+        <w:tc>
+          <w:tcPr>
+            <w:tcW w:type="dxa" w:w="2600"/>
+            <w:tcMar>
+              <w:top w:type="dxa" w:w="90"/>
+              <w:left w:type="dxa" w:w="120"/>
+              <w:bottom w:type="dxa" w:w="90"/>
+              <w:right w:type="dxa" w:w="120"/>
+            </w:tcMar>
+          </w:tcPr>
+          <w:p>
+            <w:pPr>
+              <w:spacing w:after="0" w:line="260"/>
+            </w:pPr>
+            <w:r>
+              <w:rPr>
+                <w:rFonts w:ascii="Georgia" w:cs="Georgia" w:eastAsia="Georgia" w:hAnsi="Georgia"/>
+                <w:b w:val="false"/>
+                <w:bCs w:val="false"/>
+                <w:color w:val="1A1714"/>
+                <w:sz w:val="20"/>
+                <w:szCs w:val="20"/>
+              </w:rPr>
+              <w:t xml:space="preserve">Neuro-Symbolic Integration Layer</w:t>
+            </w:r>
+          </w:p>
+        </w:tc>
+        <w:tc>
+          <w:tcPr>
+            <w:tcW w:type="dxa" w:w="3380"/>
+            <w:tcMar>
+              <w:top w:type="dxa" w:w="90"/>
+              <w:left w:type="dxa" w:w="120"/>
+              <w:bottom w:type="dxa" w:w="90"/>
+              <w:right w:type="dxa" w:w="120"/>
+            </w:tcMar>
+          </w:tcPr>
+          <w:p>
+            <w:pPr>
+              <w:spacing w:after="0" w:line="260"/>
+            </w:pPr>
+            <w:r>
+              <w:rPr>
+                <w:rFonts w:ascii="Georgia" w:cs="Georgia" w:eastAsia="Georgia" w:hAnsi="Georgia"/>
+                <w:b w:val="false"/>
+                <w:bCs w:val="false"/>
+                <w:color w:val="1A1714"/>
+                <w:sz w:val="20"/>
+                <w:szCs w:val="20"/>
+              </w:rPr>
+              <w:t xml:space="preserve">Merges neural-style perception with symbolic reasoning</w:t>
+            </w:r>
+          </w:p>
+        </w:tc>
+        <w:tc>
+          <w:tcPr>
+            <w:tcW w:type="dxa" w:w="3380"/>
+            <w:tcMar>
+              <w:top w:type="dxa" w:w="90"/>
+              <w:left w:type="dxa" w:w="120"/>
+              <w:bottom w:type="dxa" w:w="90"/>
+              <w:right w:type="dxa" w:w="120"/>
+            </w:tcMar>
+          </w:tcPr>
+          <w:p>
+            <w:pPr>
+              <w:spacing w:after="0" w:line="260"/>
+            </w:pPr>
+            <w:r>
+              <w:rPr>
+                <w:rFonts w:ascii="Georgia" w:cs="Georgia" w:eastAsia="Georgia" w:hAnsi="Georgia"/>
+                <w:b w:val="false"/>
+                <w:bCs w:val="false"/>
+                <w:color w:val="1A1714"/>
+                <w:sz w:val="20"/>
+                <w:szCs w:val="20"/>
+              </w:rPr>
+              <w:t xml:space="preserve">Enables unified cognition</w:t>
+            </w:r>
+          </w:p>
+        </w:tc>
+      </w:tr>
+      <w:tr>
+        <w:tc>
+          <w:tcPr>
+            <w:tcW w:type="dxa" w:w="2600"/>
+            <w:tcMar>
+              <w:top w:type="dxa" w:w="90"/>
+              <w:left w:type="dxa" w:w="120"/>
+              <w:bottom w:type="dxa" w:w="90"/>
+              <w:right w:type="dxa" w:w="120"/>
+            </w:tcMar>
+          </w:tcPr>
+          <w:p>
+            <w:pPr>
+              <w:spacing w:after="0" w:line="260"/>
+            </w:pPr>
+            <w:r>
+              <w:rPr>
+                <w:rFonts w:ascii="Georgia" w:cs="Georgia" w:eastAsia="Georgia" w:hAnsi="Georgia"/>
+                <w:b w:val="false"/>
+                <w:bCs w:val="false"/>
+                <w:color w:val="1A1714"/>
+                <w:sz w:val="20"/>
+                <w:szCs w:val="20"/>
+              </w:rPr>
+              <w:t xml:space="preserve">Hypergraph Reasoning Layer</w:t>
+            </w:r>
+          </w:p>
+        </w:tc>
+        <w:tc>
+          <w:tcPr>
+            <w:tcW w:type="dxa" w:w="3380"/>
+            <w:tcMar>
+              <w:top w:type="dxa" w:w="90"/>
+              <w:left w:type="dxa" w:w="120"/>
+              <w:bottom w:type="dxa" w:w="90"/>
+              <w:right w:type="dxa" w:w="120"/>
+            </w:tcMar>
+          </w:tcPr>
+          <w:p>
+            <w:pPr>
+              <w:spacing w:after="0" w:line="260"/>
+            </w:pPr>
+            <w:r>
+              <w:rPr>
+                <w:rFonts w:ascii="Georgia" w:cs="Georgia" w:eastAsia="Georgia" w:hAnsi="Georgia"/>
+                <w:b w:val="false"/>
+                <w:bCs w:val="false"/>
+                <w:color w:val="1A1714"/>
+                <w:sz w:val="20"/>
+                <w:szCs w:val="20"/>
+              </w:rPr>
+              <w:t xml:space="preserve">Connects multi-domain concepts</w:t>
+            </w:r>
+          </w:p>
+        </w:tc>
+        <w:tc>
+          <w:tcPr>
+            <w:tcW w:type="dxa" w:w="3380"/>
+            <w:tcMar>
+              <w:top w:type="dxa" w:w="90"/>
+              <w:left w:type="dxa" w:w="120"/>
+              <w:bottom w:type="dxa" w:w="90"/>
+              <w:right w:type="dxa" w:w="120"/>
+            </w:tcMar>
+          </w:tcPr>
+          <w:p>
+            <w:pPr>
+              <w:spacing w:after="0" w:line="260"/>
+            </w:pPr>
+            <w:r>
+              <w:rPr>
+                <w:rFonts w:ascii="Georgia" w:cs="Georgia" w:eastAsia="Georgia" w:hAnsi="Georgia"/>
+                <w:b w:val="false"/>
+                <w:bCs w:val="false"/>
+                <w:color w:val="1A1714"/>
+                <w:sz w:val="20"/>
+                <w:szCs w:val="20"/>
+              </w:rPr>
+              <w:t xml:space="preserve">Enables cross-domain synthesis</w:t>
+            </w:r>
+          </w:p>
+        </w:tc>
+      </w:tr>
+      <w:tr>
+        <w:tc>
+          <w:tcPr>
+            <w:tcW w:type="dxa" w:w="2600"/>
+            <w:tcMar>
+              <w:top w:type="dxa" w:w="90"/>
+              <w:left w:type="dxa" w:w="120"/>
+              <w:bottom w:type="dxa" w:w="90"/>
+              <w:right w:type="dxa" w:w="120"/>
+            </w:tcMar>
+          </w:tcPr>
+          <w:p>
+            <w:pPr>
+              <w:spacing w:after="0" w:line="260"/>
+            </w:pPr>
+            <w:r>
+              <w:rPr>
+                <w:rFonts w:ascii="Georgia" w:cs="Georgia" w:eastAsia="Georgia" w:hAnsi="Georgia"/>
+                <w:b w:val="false"/>
+                <w:bCs w:val="false"/>
+                <w:color w:val="1A1714"/>
+                <w:sz w:val="20"/>
+                <w:szCs w:val="20"/>
+              </w:rPr>
+              <w:t xml:space="preserve">Concept Compression Layer</w:t>
+            </w:r>
+          </w:p>
+        </w:tc>
+        <w:tc>
+          <w:tcPr>
+            <w:tcW w:type="dxa" w:w="3380"/>
+            <w:tcMar>
+              <w:top w:type="dxa" w:w="90"/>
+              <w:left w:type="dxa" w:w="120"/>
+              <w:bottom w:type="dxa" w:w="90"/>
+              <w:right w:type="dxa" w:w="120"/>
+            </w:tcMar>
+          </w:tcPr>
+          <w:p>
+            <w:pPr>
+              <w:spacing w:after="0" w:line="260"/>
+            </w:pPr>
+            <w:r>
+              <w:rPr>
+                <w:rFonts w:ascii="Georgia" w:cs="Georgia" w:eastAsia="Georgia" w:hAnsi="Georgia"/>
+                <w:b w:val="false"/>
+                <w:bCs w:val="false"/>
+                <w:color w:val="1A1714"/>
+                <w:sz w:val="20"/>
+                <w:szCs w:val="20"/>
+              </w:rPr>
+              <w:t xml:space="preserve">Performs noise elimination and abstraction</w:t>
+            </w:r>
+          </w:p>
+        </w:tc>
+        <w:tc>
+          <w:tcPr>
+            <w:tcW w:type="dxa" w:w="3380"/>
+            <w:tcMar>
+              <w:top w:type="dxa" w:w="90"/>
+              <w:left w:type="dxa" w:w="120"/>
+              <w:bottom w:type="dxa" w:w="90"/>
+              <w:right w:type="dxa" w:w="120"/>
+            </w:tcMar>
+          </w:tcPr>
+          <w:p>
+            <w:pPr>
+              <w:spacing w:after="0" w:line="260"/>
+            </w:pPr>
+            <w:r>
+              <w:rPr>
+                <w:rFonts w:ascii="Georgia" w:cs="Georgia" w:eastAsia="Georgia" w:hAnsi="Georgia"/>
+                <w:b w:val="false"/>
+                <w:bCs w:val="false"/>
+                <w:color w:val="1A1714"/>
+                <w:sz w:val="20"/>
+                <w:szCs w:val="20"/>
+              </w:rPr>
+              <w:t xml:space="preserve">Enables efficient learning</w:t>
+            </w:r>
+          </w:p>
+        </w:tc>
+      </w:tr>
+      <w:tr>
+        <w:tc>
+          <w:tcPr>
+            <w:tcW w:type="dxa" w:w="2600"/>
+            <w:tcMar>
+              <w:top w:type="dxa" w:w="90"/>
+              <w:left w:type="dxa" w:w="120"/>
+              <w:bottom w:type="dxa" w:w="90"/>
+              <w:right w:type="dxa" w:w="120"/>
+            </w:tcMar>
+          </w:tcPr>
+          <w:p>
+            <w:pPr>
+              <w:spacing w:after="0" w:line="260"/>
+            </w:pPr>
+            <w:r>
+              <w:rPr>
+                <w:rFonts w:ascii="Georgia" w:cs="Georgia" w:eastAsia="Georgia" w:hAnsi="Georgia"/>
+                <w:b w:val="false"/>
+                <w:bCs w:val="false"/>
+                <w:color w:val="1A1714"/>
+                <w:sz w:val="20"/>
+                <w:szCs w:val="20"/>
+              </w:rPr>
+              <w:t xml:space="preserve">Baconian Reasoning and the Feedback Loop</w:t>
+            </w:r>
+          </w:p>
+        </w:tc>
+        <w:tc>
+          <w:tcPr>
+            <w:tcW w:type="dxa" w:w="3380"/>
+            <w:tcMar>
+              <w:top w:type="dxa" w:w="90"/>
+              <w:left w:type="dxa" w:w="120"/>
+              <w:bottom w:type="dxa" w:w="90"/>
+              <w:right w:type="dxa" w:w="120"/>
+            </w:tcMar>
+          </w:tcPr>
+          <w:p>
+            <w:pPr>
+              <w:spacing w:after="0" w:line="260"/>
+            </w:pPr>
+            <w:r>
+              <w:rPr>
+                <w:rFonts w:ascii="Georgia" w:cs="Georgia" w:eastAsia="Georgia" w:hAnsi="Georgia"/>
+                <w:b w:val="false"/>
+                <w:bCs w:val="false"/>
+                <w:color w:val="1A1714"/>
+                <w:sz w:val="20"/>
+                <w:szCs w:val="20"/>
+              </w:rPr>
+              <w:t xml:space="preserve">Admits outcomes and empirical observation as evidence</w:t>
+            </w:r>
+          </w:p>
+        </w:tc>
+        <w:tc>
+          <w:tcPr>
+            <w:tcW w:type="dxa" w:w="3380"/>
+            <w:tcMar>
+              <w:top w:type="dxa" w:w="90"/>
+              <w:left w:type="dxa" w:w="120"/>
+              <w:bottom w:type="dxa" w:w="90"/>
+              <w:right w:type="dxa" w:w="120"/>
+            </w:tcMar>
+          </w:tcPr>
+          <w:p>
+            <w:pPr>
+              <w:spacing w:after="0" w:line="260"/>
+            </w:pPr>
+            <w:r>
+              <w:rPr>
+                <w:rFonts w:ascii="Georgia" w:cs="Georgia" w:eastAsia="Georgia" w:hAnsi="Georgia"/>
+                <w:b w:val="false"/>
+                <w:bCs w:val="false"/>
+                <w:color w:val="1A1714"/>
+                <w:sz w:val="20"/>
+                <w:szCs w:val="20"/>
+              </w:rPr>
+              <w:t xml:space="preserve">Enables adaptive, empirical intelligence</w:t>
+            </w:r>
+          </w:p>
+        </w:tc>
+      </w:tr>
+    </w:tbl>
+    <w:p>
+      <w:pPr>
+        <w:spacing w:after="260" w:before="140" w:line="290"/>
+      </w:pPr>
+      <w:r>
+        <w:rPr>
+          <w:i/>
+          <w:iCs/>
+          <w:color w:val="5F5952"/>
+          <w:sz w:val="21"/>
+          <w:szCs w:val="21"/>
+        </w:rPr>
+        <w:t xml:space="preserve">Outcome: QueryBook reasons, predicts, adapts, and generalizes across domains — the hallmark of general cognition.</w:t>
+      </w:r>
+    </w:p>
+    <w:p>
+      <w:pPr>
+        <w:pStyle w:val="Heading2"/>
+        <w:spacing w:after="140" w:before="280"/>
+      </w:pPr>
+      <w:r>
+        <w:rPr>
+          <w:b/>
+          <w:bCs/>
+          <w:color w:val="1A1714"/>
+          <w:sz w:val="25"/>
+          <w:szCs w:val="25"/>
+        </w:rPr>
+        <w:t xml:space="preserve">Level Four — Autonomous Cognitive Evolution</w:t>
+      </w:r>
+    </w:p>
+    <w:tbl>
+      <w:tblPr>
+        <w:tblW w:type="dxa" w:w="9360"/>
+        <w:tblBorders>
+          <w:top w:val="single" w:color="auto" w:sz="4"/>
+          <w:left w:val="single" w:color="auto" w:sz="4"/>
+          <w:bottom w:val="single" w:color="auto" w:sz="4"/>
+          <w:right w:val="single" w:color="auto" w:sz="4"/>
+          <w:insideH w:val="single" w:color="auto" w:sz="4"/>
+          <w:insideV w:val="single" w:color="auto" w:sz="4"/>
+        </w:tblBorders>
+      </w:tblPr>
+      <w:tblGrid>
+        <w:gridCol w:w="2600"/>
+        <w:gridCol w:w="3380"/>
+        <w:gridCol w:w="3380"/>
+      </w:tblGrid>
+      <w:tr>
+        <w:trPr>
+          <w:tblHeader/>
+        </w:trPr>
+        <w:tc>
+          <w:tcPr>
+            <w:tcW w:type="dxa" w:w="2600"/>
+            <w:shd w:fill="F0ECE5" w:color="auto" w:val="clear"/>
+            <w:tcMar>
+              <w:top w:type="dxa" w:w="90"/>
+              <w:left w:type="dxa" w:w="120"/>
+              <w:bottom w:type="dxa" w:w="90"/>
+              <w:right w:type="dxa" w:w="120"/>
+            </w:tcMar>
+          </w:tcPr>
+          <w:p>
+            <w:pPr>
+              <w:spacing w:after="0" w:line="260"/>
+            </w:pPr>
+            <w:r>
+              <w:rPr>
+                <w:rFonts w:ascii="Arial" w:cs="Arial" w:eastAsia="Arial" w:hAnsi="Arial"/>
+                <w:b/>
+                <w:bCs/>
+                <w:color w:val="1A1714"/>
+                <w:sz w:val="19"/>
+                <w:szCs w:val="19"/>
+              </w:rPr>
+              <w:t xml:space="preserve">Subsystem</w:t>
+            </w:r>
+          </w:p>
+        </w:tc>
+        <w:tc>
+          <w:tcPr>
+            <w:tcW w:type="dxa" w:w="3380"/>
+            <w:shd w:fill="F0ECE5" w:color="auto" w:val="clear"/>
+            <w:tcMar>
+              <w:top w:type="dxa" w:w="90"/>
+              <w:left w:type="dxa" w:w="120"/>
+              <w:bottom w:type="dxa" w:w="90"/>
+              <w:right w:type="dxa" w:w="120"/>
+            </w:tcMar>
+          </w:tcPr>
+          <w:p>
+            <w:pPr>
+              <w:spacing w:after="0" w:line="260"/>
+            </w:pPr>
+            <w:r>
+              <w:rPr>
+                <w:rFonts w:ascii="Arial" w:cs="Arial" w:eastAsia="Arial" w:hAnsi="Arial"/>
+                <w:b/>
+                <w:bCs/>
+                <w:color w:val="1A1714"/>
+                <w:sz w:val="19"/>
+                <w:szCs w:val="19"/>
+              </w:rPr>
+              <w:t xml:space="preserve">Function</w:t>
+            </w:r>
+          </w:p>
+        </w:tc>
+        <w:tc>
+          <w:tcPr>
+            <w:tcW w:type="dxa" w:w="3380"/>
+            <w:shd w:fill="F0ECE5" w:color="auto" w:val="clear"/>
+            <w:tcMar>
+              <w:top w:type="dxa" w:w="90"/>
+              <w:left w:type="dxa" w:w="120"/>
+              <w:bottom w:type="dxa" w:w="90"/>
+              <w:right w:type="dxa" w:w="120"/>
+            </w:tcMar>
+          </w:tcPr>
+          <w:p>
+            <w:pPr>
+              <w:spacing w:after="0" w:line="260"/>
+            </w:pPr>
+            <w:r>
+              <w:rPr>
+                <w:rFonts w:ascii="Arial" w:cs="Arial" w:eastAsia="Arial" w:hAnsi="Arial"/>
+                <w:b/>
+                <w:bCs/>
+                <w:color w:val="1A1714"/>
+                <w:sz w:val="19"/>
+                <w:szCs w:val="19"/>
+              </w:rPr>
+              <w:t xml:space="preserve">Advancement</w:t>
+            </w:r>
+          </w:p>
+        </w:tc>
+      </w:tr>
+      <w:tr>
+        <w:tc>
+          <w:tcPr>
+            <w:tcW w:type="dxa" w:w="2600"/>
+            <w:tcMar>
+              <w:top w:type="dxa" w:w="90"/>
+              <w:left w:type="dxa" w:w="120"/>
+              <w:bottom w:type="dxa" w:w="90"/>
+              <w:right w:type="dxa" w:w="120"/>
+            </w:tcMar>
+          </w:tcPr>
+          <w:p>
+            <w:pPr>
+              <w:spacing w:after="0" w:line="260"/>
+            </w:pPr>
+            <w:r>
+              <w:rPr>
+                <w:rFonts w:ascii="Georgia" w:cs="Georgia" w:eastAsia="Georgia" w:hAnsi="Georgia"/>
+                <w:b w:val="false"/>
+                <w:bCs w:val="false"/>
+                <w:color w:val="1A1714"/>
+                <w:sz w:val="20"/>
+                <w:szCs w:val="20"/>
+              </w:rPr>
+              <w:t xml:space="preserve">Meta-Learning Layer</w:t>
+            </w:r>
+          </w:p>
+        </w:tc>
+        <w:tc>
+          <w:tcPr>
+            <w:tcW w:type="dxa" w:w="3380"/>
+            <w:tcMar>
+              <w:top w:type="dxa" w:w="90"/>
+              <w:left w:type="dxa" w:w="120"/>
+              <w:bottom w:type="dxa" w:w="90"/>
+              <w:right w:type="dxa" w:w="120"/>
+            </w:tcMar>
+          </w:tcPr>
+          <w:p>
+            <w:pPr>
+              <w:spacing w:after="0" w:line="260"/>
+            </w:pPr>
+            <w:r>
+              <w:rPr>
+                <w:rFonts w:ascii="Georgia" w:cs="Georgia" w:eastAsia="Georgia" w:hAnsi="Georgia"/>
+                <w:b w:val="false"/>
+                <w:bCs w:val="false"/>
+                <w:color w:val="1A1714"/>
+                <w:sz w:val="20"/>
+                <w:szCs w:val="20"/>
+              </w:rPr>
+              <w:t xml:space="preserve">Learns how to learn</w:t>
+            </w:r>
+          </w:p>
+        </w:tc>
+        <w:tc>
+          <w:tcPr>
+            <w:tcW w:type="dxa" w:w="3380"/>
+            <w:tcMar>
+              <w:top w:type="dxa" w:w="90"/>
+              <w:left w:type="dxa" w:w="120"/>
+              <w:bottom w:type="dxa" w:w="90"/>
+              <w:right w:type="dxa" w:w="120"/>
+            </w:tcMar>
+          </w:tcPr>
+          <w:p>
+            <w:pPr>
+              <w:spacing w:after="0" w:line="260"/>
+            </w:pPr>
+            <w:r>
+              <w:rPr>
+                <w:rFonts w:ascii="Georgia" w:cs="Georgia" w:eastAsia="Georgia" w:hAnsi="Georgia"/>
+                <w:b w:val="false"/>
+                <w:bCs w:val="false"/>
+                <w:color w:val="1A1714"/>
+                <w:sz w:val="20"/>
+                <w:szCs w:val="20"/>
+              </w:rPr>
+              <w:t xml:space="preserve">Enables self-improvement</w:t>
+            </w:r>
+          </w:p>
+        </w:tc>
+      </w:tr>
+      <w:tr>
+        <w:tc>
+          <w:tcPr>
+            <w:tcW w:type="dxa" w:w="2600"/>
+            <w:tcMar>
+              <w:top w:type="dxa" w:w="90"/>
+              <w:left w:type="dxa" w:w="120"/>
+              <w:bottom w:type="dxa" w:w="90"/>
+              <w:right w:type="dxa" w:w="120"/>
+            </w:tcMar>
+          </w:tcPr>
+          <w:p>
+            <w:pPr>
+              <w:spacing w:after="0" w:line="260"/>
+            </w:pPr>
+            <w:r>
+              <w:rPr>
+                <w:rFonts w:ascii="Georgia" w:cs="Georgia" w:eastAsia="Georgia" w:hAnsi="Georgia"/>
+                <w:b w:val="false"/>
+                <w:bCs w:val="false"/>
+                <w:color w:val="1A1714"/>
+                <w:sz w:val="20"/>
+                <w:szCs w:val="20"/>
+              </w:rPr>
+              <w:t xml:space="preserve">Memory Consolidation Cycle</w:t>
+            </w:r>
+          </w:p>
+        </w:tc>
+        <w:tc>
+          <w:tcPr>
+            <w:tcW w:type="dxa" w:w="3380"/>
+            <w:tcMar>
+              <w:top w:type="dxa" w:w="90"/>
+              <w:left w:type="dxa" w:w="120"/>
+              <w:bottom w:type="dxa" w:w="90"/>
+              <w:right w:type="dxa" w:w="120"/>
+            </w:tcMar>
+          </w:tcPr>
+          <w:p>
+            <w:pPr>
+              <w:spacing w:after="0" w:line="260"/>
+            </w:pPr>
+            <w:r>
+              <w:rPr>
+                <w:rFonts w:ascii="Georgia" w:cs="Georgia" w:eastAsia="Georgia" w:hAnsi="Georgia"/>
+                <w:b w:val="false"/>
+                <w:bCs w:val="false"/>
+                <w:color w:val="1A1714"/>
+                <w:sz w:val="20"/>
+                <w:szCs w:val="20"/>
+              </w:rPr>
+              <w:t xml:space="preserve">Refines and compresses concepts over time</w:t>
+            </w:r>
+          </w:p>
+        </w:tc>
+        <w:tc>
+          <w:tcPr>
+            <w:tcW w:type="dxa" w:w="3380"/>
+            <w:tcMar>
+              <w:top w:type="dxa" w:w="90"/>
+              <w:left w:type="dxa" w:w="120"/>
+              <w:bottom w:type="dxa" w:w="90"/>
+              <w:right w:type="dxa" w:w="120"/>
+            </w:tcMar>
+          </w:tcPr>
+          <w:p>
+            <w:pPr>
+              <w:spacing w:after="0" w:line="260"/>
+            </w:pPr>
+            <w:r>
+              <w:rPr>
+                <w:rFonts w:ascii="Georgia" w:cs="Georgia" w:eastAsia="Georgia" w:hAnsi="Georgia"/>
+                <w:b w:val="false"/>
+                <w:bCs w:val="false"/>
+                <w:color w:val="1A1714"/>
+                <w:sz w:val="20"/>
+                <w:szCs w:val="20"/>
+              </w:rPr>
+              <w:t xml:space="preserve">Enables long-term stability</w:t>
+            </w:r>
+          </w:p>
+        </w:tc>
+      </w:tr>
+      <w:tr>
+        <w:tc>
+          <w:tcPr>
+            <w:tcW w:type="dxa" w:w="2600"/>
+            <w:tcMar>
+              <w:top w:type="dxa" w:w="90"/>
+              <w:left w:type="dxa" w:w="120"/>
+              <w:bottom w:type="dxa" w:w="90"/>
+              <w:right w:type="dxa" w:w="120"/>
+            </w:tcMar>
+          </w:tcPr>
+          <w:p>
+            <w:pPr>
+              <w:spacing w:after="0" w:line="260"/>
+            </w:pPr>
+            <w:r>
+              <w:rPr>
+                <w:rFonts w:ascii="Georgia" w:cs="Georgia" w:eastAsia="Georgia" w:hAnsi="Georgia"/>
+                <w:b w:val="false"/>
+                <w:bCs w:val="false"/>
+                <w:color w:val="1A1714"/>
+                <w:sz w:val="20"/>
+                <w:szCs w:val="20"/>
+              </w:rPr>
+              <w:t xml:space="preserve">Adaptive Schema Engine</w:t>
+            </w:r>
+          </w:p>
+        </w:tc>
+        <w:tc>
+          <w:tcPr>
+            <w:tcW w:type="dxa" w:w="3380"/>
+            <w:tcMar>
+              <w:top w:type="dxa" w:w="90"/>
+              <w:left w:type="dxa" w:w="120"/>
+              <w:bottom w:type="dxa" w:w="90"/>
+              <w:right w:type="dxa" w:w="120"/>
+            </w:tcMar>
+          </w:tcPr>
+          <w:p>
+            <w:pPr>
+              <w:spacing w:after="0" w:line="260"/>
+            </w:pPr>
+            <w:r>
+              <w:rPr>
+                <w:rFonts w:ascii="Georgia" w:cs="Georgia" w:eastAsia="Georgia" w:hAnsi="Georgia"/>
+                <w:b w:val="false"/>
+                <w:bCs w:val="false"/>
+                <w:color w:val="1A1714"/>
+                <w:sz w:val="20"/>
+                <w:szCs w:val="20"/>
+              </w:rPr>
+              <w:t xml:space="preserve">Evolves new reasoning patterns</w:t>
+            </w:r>
+          </w:p>
+        </w:tc>
+        <w:tc>
+          <w:tcPr>
+            <w:tcW w:type="dxa" w:w="3380"/>
+            <w:tcMar>
+              <w:top w:type="dxa" w:w="90"/>
+              <w:left w:type="dxa" w:w="120"/>
+              <w:bottom w:type="dxa" w:w="90"/>
+              <w:right w:type="dxa" w:w="120"/>
+            </w:tcMar>
+          </w:tcPr>
+          <w:p>
+            <w:pPr>
+              <w:spacing w:after="0" w:line="260"/>
+            </w:pPr>
+            <w:r>
+              <w:rPr>
+                <w:rFonts w:ascii="Georgia" w:cs="Georgia" w:eastAsia="Georgia" w:hAnsi="Georgia"/>
+                <w:b w:val="false"/>
+                <w:bCs w:val="false"/>
+                <w:color w:val="1A1714"/>
+                <w:sz w:val="20"/>
+                <w:szCs w:val="20"/>
+              </w:rPr>
+              <w:t xml:space="preserve">Enables creative intelligence</w:t>
+            </w:r>
+          </w:p>
+        </w:tc>
+      </w:tr>
+      <w:tr>
+        <w:tc>
+          <w:tcPr>
+            <w:tcW w:type="dxa" w:w="2600"/>
+            <w:tcMar>
+              <w:top w:type="dxa" w:w="90"/>
+              <w:left w:type="dxa" w:w="120"/>
+              <w:bottom w:type="dxa" w:w="90"/>
+              <w:right w:type="dxa" w:w="120"/>
+            </w:tcMar>
+          </w:tcPr>
+          <w:p>
+            <w:pPr>
+              <w:spacing w:after="0" w:line="260"/>
+            </w:pPr>
+            <w:r>
+              <w:rPr>
+                <w:rFonts w:ascii="Georgia" w:cs="Georgia" w:eastAsia="Georgia" w:hAnsi="Georgia"/>
+                <w:b w:val="false"/>
+                <w:bCs w:val="false"/>
+                <w:color w:val="1A1714"/>
+                <w:sz w:val="20"/>
+                <w:szCs w:val="20"/>
+              </w:rPr>
+              <w:t xml:space="preserve">Governed Improvement Gate</w:t>
+            </w:r>
+          </w:p>
+        </w:tc>
+        <w:tc>
+          <w:tcPr>
+            <w:tcW w:type="dxa" w:w="3380"/>
+            <w:tcMar>
+              <w:top w:type="dxa" w:w="90"/>
+              <w:left w:type="dxa" w:w="120"/>
+              <w:bottom w:type="dxa" w:w="90"/>
+              <w:right w:type="dxa" w:w="120"/>
+            </w:tcMar>
+          </w:tcPr>
+          <w:p>
+            <w:pPr>
+              <w:spacing w:after="0" w:line="260"/>
+            </w:pPr>
+            <w:r>
+              <w:rPr>
+                <w:rFonts w:ascii="Georgia" w:cs="Georgia" w:eastAsia="Georgia" w:hAnsi="Georgia"/>
+                <w:b w:val="false"/>
+                <w:bCs w:val="false"/>
+                <w:color w:val="1A1714"/>
+                <w:sz w:val="20"/>
+                <w:szCs w:val="20"/>
+              </w:rPr>
+              <w:t xml:space="preserve">Requires a named human approval for every change to the system itself</w:t>
+            </w:r>
+          </w:p>
+        </w:tc>
+        <w:tc>
+          <w:tcPr>
+            <w:tcW w:type="dxa" w:w="3380"/>
+            <w:tcMar>
+              <w:top w:type="dxa" w:w="90"/>
+              <w:left w:type="dxa" w:w="120"/>
+              <w:bottom w:type="dxa" w:w="90"/>
+              <w:right w:type="dxa" w:w="120"/>
+            </w:tcMar>
+          </w:tcPr>
+          <w:p>
+            <w:pPr>
+              <w:spacing w:after="0" w:line="260"/>
+            </w:pPr>
+            <w:r>
+              <w:rPr>
+                <w:rFonts w:ascii="Georgia" w:cs="Georgia" w:eastAsia="Georgia" w:hAnsi="Georgia"/>
+                <w:b w:val="false"/>
+                <w:bCs w:val="false"/>
+                <w:color w:val="1A1714"/>
+                <w:sz w:val="20"/>
+                <w:szCs w:val="20"/>
+              </w:rPr>
+              <w:t xml:space="preserve">Enables safe, accountable evolution</w:t>
+            </w:r>
+          </w:p>
+        </w:tc>
+      </w:tr>
+    </w:tbl>
+    <w:p>
+      <w:pPr>
+        <w:spacing w:after="260" w:before="140" w:line="290"/>
+      </w:pPr>
+      <w:r>
+        <w:rPr>
+          <w:i/>
+          <w:iCs/>
+          <w:color w:val="5F5952"/>
+          <w:sz w:val="21"/>
+          <w:szCs w:val="21"/>
+        </w:rPr>
+        <w:t xml:space="preserve">Outcome: QueryBook grows conceptually without uncontrolled self-modification — autonomous evolution that remains deployable in regulated environments.</w:t>
+      </w:r>
+    </w:p>
+    <w:p>
+      <w:pPr>
+        <w:pStyle w:val="Heading1"/>
+        <w:spacing w:after="180" w:before="360"/>
+      </w:pPr>
+      <w:r>
+        <w:rPr>
+          <w:b/>
+          <w:bCs/>
+          <w:color w:val="1A1714"/>
+          <w:sz w:val="30"/>
+          <w:szCs w:val="30"/>
+        </w:rPr>
+        <w:t xml:space="preserve">Commentary on Neuromorphic Correspondences</w:t>
+      </w:r>
+    </w:p>
+    <w:p>
+      <w:pPr>
+        <w:spacing w:after="180" w:line="300"/>
+      </w:pPr>
+      <w:r>
+        <w:rPr>
+          <w:color w:val="1A1714"/>
+          <w:sz w:val="22"/>
+          <w:szCs w:val="22"/>
+        </w:rPr>
+        <w:t xml:space="preserve">Every biological parallel in the body of this document is offered in one of two registers, and this commentary, kept separate from the text so the text reads cleanly, states which is which. Under the governing correspondence methodology, a neuromorphic correspondence is admitted as a claim only where the primary scientific publication establishing the finding is verified, the correspondence is identified in a mechanism that already exists rather than invented for it, a deterministic structural principle is extracted, and any trained or stochastic component of the source theory is excluded. A correspondence explains why a mechanism is well-founded; it does not justify the mechanism, no claim recites a correspondence as an element, and no mechanism in this system is adopted because it resembles a biological one.</w:t>
+      </w:r>
+    </w:p>
+    <w:p>
+      <w:pPr>
+        <w:spacing w:after="180" w:line="300"/>
+      </w:pPr>
+      <w:r>
+        <w:rPr>
+          <w:color w:val="1A1714"/>
+          <w:sz w:val="22"/>
+          <w:szCs w:val="22"/>
+        </w:rPr>
+        <w:t xml:space="preserve">Five correspondences are claimed under that methodology. Convergence dynamics: the retrieval-stabilization network is an attractor network in the sense of Hopfield (1982), with its capacity ceiling established by Amit, Gutfreund and Sompolinsky (1985) as a first-order phase boundary. Attentional competition: Competitive Candidate Resolution implements biased competition as identified by Desimone and Duncan (1995), with lateral inhibition among candidates and the accumulated evidence behind each candidate serving as the bias. Consolidation: the resistance of a settled concept to revision corresponds to synaptic consolidation, with the arithmetic of elastic weight consolidation as formulated by Kirkpatrick et al. (2017). Intersensory redundancy: the cross-modality confidence elevation corresponds to the finding of Bahrick and Lickliter (2000) that a property presented concurrently to two or more senses is detected earlier and more reliably. Spatial coding: spatial indexing over a hexagonal tiling corresponds to the firing structure of entorhinal grid cells reported by Hafting et al. (2005), with the retention of object identity across occlusion corresponding to object permanence as described by Piaget (1954).</w:t>
+      </w:r>
+    </w:p>
+    <w:p>
+      <w:pPr>
+        <w:spacing w:after="180" w:line="300"/>
+      </w:pPr>
+      <w:r>
+        <w:rPr>
+          <w:color w:val="1A1714"/>
+          <w:sz w:val="22"/>
+          <w:szCs w:val="22"/>
+        </w:rPr>
+        <w:t xml:space="preserve">Everything else in this document that speaks in a biological voice is plain-language analogy, deliberately outside the claimed set: the cortical-column description of the Fact Unit, the characterization of the Neuromorphic Cognitive Layer as a synthetic cortex, the likening of semantic edges to white-matter pathways, the hippocampus parallel offered for episodic simulation, the prefrontal-cortex parallel offered for cross-temporal reasoning, the reward-system counterpart offered for the motivational architecture, and the description of consolidation cycles as the system’s equivalent of sleep. These analogies are aids to understanding. The full brain-region-to-component mapping that appeared in earlier source material is deliberately not claimed, because none of its pairings rests on a primary result of the required form, and admitting weak parallels alongside verified correspondences would place the verified ones under the same doubt.</w:t>
+      </w:r>
+    </w:p>
+    <w:p>
+      <w:pPr>
+        <w:spacing w:after="180" w:line="300"/>
+      </w:pPr>
+      <w:r>
+        <w:rPr>
+          <w:color w:val="1A1714"/>
+          <w:sz w:val="22"/>
+          <w:szCs w:val="22"/>
+        </w:rPr>
+        <w:t xml:space="preserve">A note on the projections stated in the compression, expansion, and translation discussion: those are projected advantages pending measured validation, labeled as such where they appear, and are not asserted as verified performance claims, consistent with this document’s practice of citing only claims traceable to specified mechanisms.</w:t>
       </w:r>
     </w:p>
     <w:sectPr>

</xml_diff>